<commit_message>
Publish reviewed Google-ORS report and frozen afternoon evidence
</commit_message>
<xml_diff>
--- a/RMT_A3_Team_AkhanovYerdaulet_ShadiyarbekSyrym_SabyrzhanAkylbek.docx
+++ b/RMT_A3_Team_AkhanovYerdaulet_ShadiyarbekSyrym_SabyrzhanAkylbek.docx
@@ -36,7 +36,7 @@
           <w:rFonts w:ascii="Arial" w:hAnsi="Arial"/>
           <w:color w:val="000000"/>
         </w:rPr>
-        <w:t>Status: executed ORS instrument pilot; the primary traffic-aware comparison has not been performed.</w:t>
+        <w:t>Status: executed ORS instrument pilot and separate exploratory Google–ORS test; Google–ORS period comparison planned; initial TomTom–2GIS comparison unperformed.</w:t>
       </w:r>
     </w:p>
     <w:p>
@@ -48,7 +48,7 @@
           <w:rFonts w:ascii="Arial" w:hAnsi="Arial"/>
           <w:color w:val="000000"/>
         </w:rPr>
-        <w:t xml:space="preserve">Evidence snapshot: 2026-10-24T02:53:12.358983+00:00. Public repository: </w:t>
+        <w:t xml:space="preserve">ORS analysis snapshot: 2026-10-24T11:13:51.125096+00:00. Public repository: </w:t>
       </w:r>
       <w:hyperlink r:id="rId10">
         <w:r>
@@ -85,7 +85,7 @@
           <w:rFonts w:ascii="Arial" w:hAnsi="Arial"/>
           <w:color w:val="000000"/>
         </w:rPr>
-        <w:t>How do TomTom and 2GIS traffic-aware travel-time estimates diverge on fixed Astana routes during evening peak compared with off-peak periods?</w:t>
+        <w:t>How do Google traffic-aware travel-time estimates differ from ORS control estimates on fixed Astana routes during peak and off-peak periods?</w:t>
       </w:r>
     </w:p>
     <w:p>
@@ -97,7 +97,19 @@
           <w:rFonts w:ascii="Arial" w:hAnsi="Arial"/>
           <w:color w:val="000000"/>
         </w:rPr>
-        <w:t>The question isolates disagreement between services for common endpoints and time periods. Its strength is an observable comparison with a fixed unit and a clear temporal contrast. Its weakness is that services can recommend different streets and apply undisclosed models. Neither estimate is an observed journey. The original Assignment 2 Google Maps–2GIS design was amended after access and publication checks. TomTom–2GIS remains the prospective question, while the completed work concerns the ORS instrument. This distinction prevents successful software operation from being presented as an answer about congestion.</w:t>
+        <w:t>The amended question compares traffic-aware Google estimates with an ORS control that lacks live traffic. Common endpoints and defined periods make disagreement observable, but provider models and recommended streets also differ. Neither service supplies observed journeys. After the initial TomTom–2GIS design remained unperformed, the team approved this dated Google–ORS design and its aggregate-only retention. The completed exploratory cycle establishes a descriptive starting point; it does not answer the peak-versus-off-peak question.</w:t>
+      </w:r>
+    </w:p>
+    <w:p>
+      <w:pPr>
+        <w:widowControl/>
+      </w:pPr>
+      <w:r>
+        <w:rPr>
+          <w:rFonts w:ascii="Arial" w:hAnsi="Arial"/>
+          <w:color w:val="000000"/>
+        </w:rPr>
+        <w:t>Dated amendment: 2026-10-24T11:32:30.838148+00:00. Initial preregistered question, retained for provenance: How do TomTom and 2GIS traffic-aware travel-time estimates diverge on fixed Astana routes during evening peak compared with off-peak periods?</w:t>
       </w:r>
     </w:p>
     <w:tbl>
@@ -316,7 +328,7 @@
                 <w:sz w:val="18"/>
               </w:rPr>
               <w:br/>
-              <w:t>Archive upload pending verification at this snapshot</w:t>
+              <w:t>Archive available; anyone with the link can read it</w:t>
             </w:r>
           </w:p>
         </w:tc>
@@ -389,7 +401,7 @@
           <w:rFonts w:ascii="Arial" w:hAnsi="Arial"/>
           <w:color w:val="000000"/>
         </w:rPr>
-        <w:t>The approach is quantitative secondary-data analysis using repeated observations. Researchers select requests but do not manipulate road conditions, allocate traffic treatments or recruit drivers. It is therefore an observational comparison, not an experiment. Repeated endpoints reduce spatial inconsistency and make variation auditable. However, purposive route selection and a short observation window limit generalisation. Repeated requests on one route are dependent; their number cannot be treated as the number of independent roads. ORS offers a practical control for the collection workflow but lacks the live-traffic signal required by the main question.</w:t>
+        <w:t>The approach is quantitative secondary-data analysis using repeated observations. Researchers select requests but do not manipulate road conditions, allocate traffic treatments or recruit drivers. It is therefore observational. Repeated endpoints reduce spatial inconsistency. Purposive route selection and a short window limit generalisation, while repeated requests on one route remain dependent. ORS supplies a control without live traffic; Google uses a traffic-aware request preference. This contrast measures disagreement between complete service outputs, not the isolated causal effect of traffic.</w:t>
       </w:r>
     </w:p>
     <w:tbl>
@@ -1193,7 +1205,7 @@
                 <w:color w:val="000000"/>
                 <w:sz w:val="18"/>
               </w:rPr>
-              <w:t>ORS estimate, distance, geometry, status, timestamps and elapsed request time</w:t>
+              <w:t>ORS estimate, distance, geometry, status, timestamps and elapsed request time; separate aggregate Google–ORS disagreement</w:t>
             </w:r>
           </w:p>
         </w:tc>
@@ -1238,7 +1250,7 @@
                 <w:color w:val="000000"/>
                 <w:sz w:val="18"/>
               </w:rPr>
-              <w:t>Actual trips, driver behavior, live traffic or TomTom–2GIS disagreement</w:t>
+              <w:t>Actual trips, driver behavior, independently measured traffic conditions or TomTom–2GIS disagreement</w:t>
             </w:r>
           </w:p>
         </w:tc>
@@ -1311,7 +1323,7 @@
           <w:rFonts w:ascii="Arial" w:hAnsi="Arial"/>
           <w:color w:val="000000"/>
         </w:rPr>
-        <w:t>The strategy is a bounded Astana case study with purposive sampling of public arterial corridors and landmarks. Common endpoints specify the requested journey rather than forcing a common returned path. A practical consequence is that analysis must preserve both all eligible pairs and a length-comparable subset. Similar distance alone cannot prove street-level equivalence. The design therefore keeps geometry where its licence permits, records route definitions separately, and avoids interpreting differences as provider error. The instrument phase can proceed independently without changing the predeclared traffic hypotheses.</w:t>
+        <w:t>The strategy is a bounded Astana case study with purposive sampling of public arterial corridors and landmarks. Common endpoints specify a requested journey, not a common returned path. Similar distance cannot prove street-level equivalence. The initial design planned pair-level sensitivity analysis; the amended protocol instead reports aggregate disagreement and the proportion of lengths within five percent of the pair mean. Permitted ORS geometry remains available, while Google individual outputs are transient. Differences cannot be interpreted as provider error.</w:t>
       </w:r>
     </w:p>
     <w:p>
@@ -1507,7 +1519,7 @@
                 <w:color w:val="000000"/>
                 <w:sz w:val="18"/>
               </w:rPr>
-              <w:t>Achieved snapshot</w:t>
+              <w:t>Achieved ORS snapshot</w:t>
             </w:r>
           </w:p>
         </w:tc>
@@ -1527,7 +1539,7 @@
                 <w:color w:val="000000"/>
                 <w:sz w:val="18"/>
               </w:rPr>
-              <w:t>64 raw rows; 64 unique requests; 64 usable observations; 0 primary pairs</w:t>
+              <w:t>68 raw rows; 68 unique requests; 68 usable observations; 0 initial TomTom–2GIS pairs</w:t>
             </w:r>
           </w:p>
         </w:tc>
@@ -1658,6 +1670,591 @@
         <w:t>Coordinates were fixed before research collection using public OpenStreetMap endpoint records. Reverse directions are distinct cases because access and road direction can differ. The expected-length column is a spherical straight-line lower bound, not a measured driving distance. It supports a geographic plausibility check and must not be substituted for the returned route length. The sample contains named corridors rather than personal origins. Selection does not give every Astana journey a known probability of inclusion, so the intended conclusions remain conditional on these cases.</w:t>
       </w:r>
     </w:p>
+    <w:tbl>
+      <w:tblPr>
+        <w:tblW w:type="auto" w:w="0"/>
+        <w:jc w:val="center"/>
+        <w:tblLayout w:type="fixed"/>
+        <w:tblLook w:firstColumn="1" w:firstRow="1" w:lastColumn="0" w:lastRow="0" w:noHBand="0" w:noVBand="1" w:val="04A0"/>
+        <w:tblBorders>
+          <w:top w:val="single" w:sz="4" w:color="B8B8B8"/>
+          <w:left w:val="single" w:sz="4" w:color="B8B8B8"/>
+          <w:bottom w:val="single" w:sz="4" w:color="B8B8B8"/>
+          <w:right w:val="single" w:sz="4" w:color="B8B8B8"/>
+          <w:insideH w:val="single" w:sz="4" w:color="B8B8B8"/>
+          <w:insideV w:val="single" w:sz="4" w:color="B8B8B8"/>
+        </w:tblBorders>
+        <w:tblCellMar>
+          <w:top w:w="80" w:type="dxa"/>
+          <w:bottom w:w="80" w:type="dxa"/>
+          <w:left w:w="80" w:type="dxa"/>
+          <w:right w:w="80" w:type="dxa"/>
+        </w:tblCellMar>
+      </w:tblPr>
+      <w:tblGrid>
+        <w:gridCol w:w="2551"/>
+        <w:gridCol w:w="3118"/>
+        <w:gridCol w:w="2268"/>
+        <w:gridCol w:w="1701"/>
+      </w:tblGrid>
+      <w:tr>
+        <w:trPr>
+          <w:tblHeader/>
+          <w:cantSplit/>
+        </w:trPr>
+        <w:tc>
+          <w:tcPr>
+            <w:tcW w:type="dxa" w:w="2551"/>
+            <w:vAlign w:val="center"/>
+            <w:shd w:fill="EAEAEA"/>
+          </w:tcPr>
+          <w:p>
+            <w:pPr>
+              <w:keepNext/>
+              <w:spacing w:after="40" w:line="240" w:lineRule="auto"/>
+            </w:pPr>
+            <w:r>
+              <w:rPr>
+                <w:rFonts w:ascii="Arial" w:hAnsi="Arial"/>
+                <w:b/>
+                <w:color w:val="000000"/>
+                <w:sz w:val="18"/>
+              </w:rPr>
+              <w:t>Amended Google–ORS date</w:t>
+            </w:r>
+          </w:p>
+        </w:tc>
+        <w:tc>
+          <w:tcPr>
+            <w:tcW w:type="dxa" w:w="3118"/>
+            <w:vAlign w:val="center"/>
+            <w:shd w:fill="EAEAEA"/>
+          </w:tcPr>
+          <w:p>
+            <w:pPr>
+              <w:keepNext/>
+              <w:spacing w:after="40" w:line="240" w:lineRule="auto"/>
+            </w:pPr>
+            <w:r>
+              <w:rPr>
+                <w:rFonts w:ascii="Arial" w:hAnsi="Arial"/>
+                <w:b/>
+                <w:color w:val="000000"/>
+                <w:sz w:val="18"/>
+              </w:rPr>
+              <w:t>Local eligibility window</w:t>
+            </w:r>
+          </w:p>
+        </w:tc>
+        <w:tc>
+          <w:tcPr>
+            <w:tcW w:type="dxa" w:w="2268"/>
+            <w:vAlign w:val="center"/>
+            <w:shd w:fill="EAEAEA"/>
+          </w:tcPr>
+          <w:p>
+            <w:pPr>
+              <w:keepNext/>
+              <w:spacing w:after="40" w:line="240" w:lineRule="auto"/>
+            </w:pPr>
+            <w:r>
+              <w:rPr>
+                <w:rFonts w:ascii="Arial" w:hAnsi="Arial"/>
+                <w:b/>
+                <w:color w:val="000000"/>
+                <w:sz w:val="18"/>
+              </w:rPr>
+              <w:t>Period</w:t>
+            </w:r>
+          </w:p>
+        </w:tc>
+        <w:tc>
+          <w:tcPr>
+            <w:tcW w:type="dxa" w:w="1701"/>
+            <w:vAlign w:val="center"/>
+            <w:shd w:fill="EAEAEA"/>
+          </w:tcPr>
+          <w:p>
+            <w:pPr>
+              <w:keepNext/>
+              <w:spacing w:after="40" w:line="240" w:lineRule="auto"/>
+            </w:pPr>
+            <w:r>
+              <w:rPr>
+                <w:rFonts w:ascii="Arial" w:hAnsi="Arial"/>
+                <w:b/>
+                <w:color w:val="000000"/>
+                <w:sz w:val="18"/>
+              </w:rPr>
+              <w:t>Planned pairs</w:t>
+            </w:r>
+          </w:p>
+        </w:tc>
+      </w:tr>
+      <w:tr>
+        <w:trPr>
+          <w:cantSplit/>
+        </w:trPr>
+        <w:tc>
+          <w:tcPr>
+            <w:tcW w:type="dxa" w:w="2551"/>
+            <w:vAlign w:val="center"/>
+          </w:tcPr>
+          <w:p>
+            <w:pPr>
+              <w:keepNext/>
+              <w:spacing w:after="40" w:line="240" w:lineRule="auto"/>
+            </w:pPr>
+            <w:r>
+              <w:rPr>
+                <w:rFonts w:ascii="Arial" w:hAnsi="Arial"/>
+                <w:color w:val="000000"/>
+                <w:sz w:val="18"/>
+              </w:rPr>
+              <w:t>24 Oct 2026</w:t>
+            </w:r>
+          </w:p>
+        </w:tc>
+        <w:tc>
+          <w:tcPr>
+            <w:tcW w:type="dxa" w:w="3118"/>
+            <w:vAlign w:val="center"/>
+          </w:tcPr>
+          <w:p>
+            <w:pPr>
+              <w:keepNext/>
+              <w:spacing w:after="40" w:line="240" w:lineRule="auto"/>
+            </w:pPr>
+            <w:r>
+              <w:rPr>
+                <w:rFonts w:ascii="Arial" w:hAnsi="Arial"/>
+                <w:color w:val="000000"/>
+                <w:sz w:val="18"/>
+              </w:rPr>
+              <w:t>17:30–19:30</w:t>
+            </w:r>
+          </w:p>
+        </w:tc>
+        <w:tc>
+          <w:tcPr>
+            <w:tcW w:type="dxa" w:w="2268"/>
+            <w:vAlign w:val="center"/>
+          </w:tcPr>
+          <w:p>
+            <w:pPr>
+              <w:keepNext/>
+              <w:spacing w:after="40" w:line="240" w:lineRule="auto"/>
+            </w:pPr>
+            <w:r>
+              <w:rPr>
+                <w:rFonts w:ascii="Arial" w:hAnsi="Arial"/>
+                <w:color w:val="000000"/>
+                <w:sz w:val="18"/>
+              </w:rPr>
+              <w:t>peak</w:t>
+            </w:r>
+          </w:p>
+        </w:tc>
+        <w:tc>
+          <w:tcPr>
+            <w:tcW w:type="dxa" w:w="1701"/>
+            <w:vAlign w:val="center"/>
+          </w:tcPr>
+          <w:p>
+            <w:pPr>
+              <w:keepNext/>
+              <w:spacing w:after="40" w:line="240" w:lineRule="auto"/>
+            </w:pPr>
+            <w:r>
+              <w:rPr>
+                <w:rFonts w:ascii="Arial" w:hAnsi="Arial"/>
+                <w:color w:val="000000"/>
+                <w:sz w:val="18"/>
+              </w:rPr>
+              <w:t>20</w:t>
+            </w:r>
+          </w:p>
+        </w:tc>
+      </w:tr>
+      <w:tr>
+        <w:trPr>
+          <w:cantSplit/>
+        </w:trPr>
+        <w:tc>
+          <w:tcPr>
+            <w:tcW w:type="dxa" w:w="2551"/>
+            <w:vAlign w:val="center"/>
+          </w:tcPr>
+          <w:p>
+            <w:pPr>
+              <w:keepNext/>
+              <w:spacing w:after="40" w:line="240" w:lineRule="auto"/>
+            </w:pPr>
+            <w:r>
+              <w:rPr>
+                <w:rFonts w:ascii="Arial" w:hAnsi="Arial"/>
+                <w:color w:val="000000"/>
+                <w:sz w:val="18"/>
+              </w:rPr>
+              <w:t>24 Oct 2026</w:t>
+            </w:r>
+          </w:p>
+        </w:tc>
+        <w:tc>
+          <w:tcPr>
+            <w:tcW w:type="dxa" w:w="3118"/>
+            <w:vAlign w:val="center"/>
+          </w:tcPr>
+          <w:p>
+            <w:pPr>
+              <w:keepNext/>
+              <w:spacing w:after="40" w:line="240" w:lineRule="auto"/>
+            </w:pPr>
+            <w:r>
+              <w:rPr>
+                <w:rFonts w:ascii="Arial" w:hAnsi="Arial"/>
+                <w:color w:val="000000"/>
+                <w:sz w:val="18"/>
+              </w:rPr>
+              <w:t>22:00–00:00</w:t>
+            </w:r>
+          </w:p>
+        </w:tc>
+        <w:tc>
+          <w:tcPr>
+            <w:tcW w:type="dxa" w:w="2268"/>
+            <w:vAlign w:val="center"/>
+          </w:tcPr>
+          <w:p>
+            <w:pPr>
+              <w:keepNext/>
+              <w:spacing w:after="40" w:line="240" w:lineRule="auto"/>
+            </w:pPr>
+            <w:r>
+              <w:rPr>
+                <w:rFonts w:ascii="Arial" w:hAnsi="Arial"/>
+                <w:color w:val="000000"/>
+                <w:sz w:val="18"/>
+              </w:rPr>
+              <w:t>offpeak</w:t>
+            </w:r>
+          </w:p>
+        </w:tc>
+        <w:tc>
+          <w:tcPr>
+            <w:tcW w:type="dxa" w:w="1701"/>
+            <w:vAlign w:val="center"/>
+          </w:tcPr>
+          <w:p>
+            <w:pPr>
+              <w:keepNext/>
+              <w:spacing w:after="40" w:line="240" w:lineRule="auto"/>
+            </w:pPr>
+            <w:r>
+              <w:rPr>
+                <w:rFonts w:ascii="Arial" w:hAnsi="Arial"/>
+                <w:color w:val="000000"/>
+                <w:sz w:val="18"/>
+              </w:rPr>
+              <w:t>20</w:t>
+            </w:r>
+          </w:p>
+        </w:tc>
+      </w:tr>
+      <w:tr>
+        <w:trPr>
+          <w:cantSplit/>
+        </w:trPr>
+        <w:tc>
+          <w:tcPr>
+            <w:tcW w:type="dxa" w:w="2551"/>
+            <w:vAlign w:val="center"/>
+          </w:tcPr>
+          <w:p>
+            <w:pPr>
+              <w:keepNext/>
+              <w:spacing w:after="40" w:line="240" w:lineRule="auto"/>
+            </w:pPr>
+            <w:r>
+              <w:rPr>
+                <w:rFonts w:ascii="Arial" w:hAnsi="Arial"/>
+                <w:color w:val="000000"/>
+                <w:sz w:val="18"/>
+              </w:rPr>
+              <w:t>25 Oct 2026</w:t>
+            </w:r>
+          </w:p>
+        </w:tc>
+        <w:tc>
+          <w:tcPr>
+            <w:tcW w:type="dxa" w:w="3118"/>
+            <w:vAlign w:val="center"/>
+          </w:tcPr>
+          <w:p>
+            <w:pPr>
+              <w:keepNext/>
+              <w:spacing w:after="40" w:line="240" w:lineRule="auto"/>
+            </w:pPr>
+            <w:r>
+              <w:rPr>
+                <w:rFonts w:ascii="Arial" w:hAnsi="Arial"/>
+                <w:color w:val="000000"/>
+                <w:sz w:val="18"/>
+              </w:rPr>
+              <w:t>10:00–12:00</w:t>
+            </w:r>
+          </w:p>
+        </w:tc>
+        <w:tc>
+          <w:tcPr>
+            <w:tcW w:type="dxa" w:w="2268"/>
+            <w:vAlign w:val="center"/>
+          </w:tcPr>
+          <w:p>
+            <w:pPr>
+              <w:keepNext/>
+              <w:spacing w:after="40" w:line="240" w:lineRule="auto"/>
+            </w:pPr>
+            <w:r>
+              <w:rPr>
+                <w:rFonts w:ascii="Arial" w:hAnsi="Arial"/>
+                <w:color w:val="000000"/>
+                <w:sz w:val="18"/>
+              </w:rPr>
+              <w:t>offpeak</w:t>
+            </w:r>
+          </w:p>
+        </w:tc>
+        <w:tc>
+          <w:tcPr>
+            <w:tcW w:type="dxa" w:w="1701"/>
+            <w:vAlign w:val="center"/>
+          </w:tcPr>
+          <w:p>
+            <w:pPr>
+              <w:keepNext/>
+              <w:spacing w:after="40" w:line="240" w:lineRule="auto"/>
+            </w:pPr>
+            <w:r>
+              <w:rPr>
+                <w:rFonts w:ascii="Arial" w:hAnsi="Arial"/>
+                <w:color w:val="000000"/>
+                <w:sz w:val="18"/>
+              </w:rPr>
+              <w:t>20</w:t>
+            </w:r>
+          </w:p>
+        </w:tc>
+      </w:tr>
+      <w:tr>
+        <w:trPr>
+          <w:cantSplit/>
+        </w:trPr>
+        <w:tc>
+          <w:tcPr>
+            <w:tcW w:type="dxa" w:w="2551"/>
+            <w:vAlign w:val="center"/>
+          </w:tcPr>
+          <w:p>
+            <w:pPr>
+              <w:keepNext/>
+              <w:spacing w:after="40" w:line="240" w:lineRule="auto"/>
+            </w:pPr>
+            <w:r>
+              <w:rPr>
+                <w:rFonts w:ascii="Arial" w:hAnsi="Arial"/>
+                <w:color w:val="000000"/>
+                <w:sz w:val="18"/>
+              </w:rPr>
+              <w:t>25 Oct 2026</w:t>
+            </w:r>
+          </w:p>
+        </w:tc>
+        <w:tc>
+          <w:tcPr>
+            <w:tcW w:type="dxa" w:w="3118"/>
+            <w:vAlign w:val="center"/>
+          </w:tcPr>
+          <w:p>
+            <w:pPr>
+              <w:keepNext/>
+              <w:spacing w:after="40" w:line="240" w:lineRule="auto"/>
+            </w:pPr>
+            <w:r>
+              <w:rPr>
+                <w:rFonts w:ascii="Arial" w:hAnsi="Arial"/>
+                <w:color w:val="000000"/>
+                <w:sz w:val="18"/>
+              </w:rPr>
+              <w:t>17:30–19:30</w:t>
+            </w:r>
+          </w:p>
+        </w:tc>
+        <w:tc>
+          <w:tcPr>
+            <w:tcW w:type="dxa" w:w="2268"/>
+            <w:vAlign w:val="center"/>
+          </w:tcPr>
+          <w:p>
+            <w:pPr>
+              <w:keepNext/>
+              <w:spacing w:after="40" w:line="240" w:lineRule="auto"/>
+            </w:pPr>
+            <w:r>
+              <w:rPr>
+                <w:rFonts w:ascii="Arial" w:hAnsi="Arial"/>
+                <w:color w:val="000000"/>
+                <w:sz w:val="18"/>
+              </w:rPr>
+              <w:t>peak</w:t>
+            </w:r>
+          </w:p>
+        </w:tc>
+        <w:tc>
+          <w:tcPr>
+            <w:tcW w:type="dxa" w:w="1701"/>
+            <w:vAlign w:val="center"/>
+          </w:tcPr>
+          <w:p>
+            <w:pPr>
+              <w:keepNext/>
+              <w:spacing w:after="40" w:line="240" w:lineRule="auto"/>
+            </w:pPr>
+            <w:r>
+              <w:rPr>
+                <w:rFonts w:ascii="Arial" w:hAnsi="Arial"/>
+                <w:color w:val="000000"/>
+                <w:sz w:val="18"/>
+              </w:rPr>
+              <w:t>20</w:t>
+            </w:r>
+          </w:p>
+        </w:tc>
+      </w:tr>
+      <w:tr>
+        <w:trPr>
+          <w:cantSplit/>
+        </w:trPr>
+        <w:tc>
+          <w:tcPr>
+            <w:tcW w:type="dxa" w:w="2551"/>
+            <w:vAlign w:val="center"/>
+          </w:tcPr>
+          <w:p>
+            <w:pPr>
+              <w:keepNext w:val="0"/>
+              <w:spacing w:after="40" w:line="240" w:lineRule="auto"/>
+            </w:pPr>
+            <w:r>
+              <w:rPr>
+                <w:rFonts w:ascii="Arial" w:hAnsi="Arial"/>
+                <w:color w:val="000000"/>
+                <w:sz w:val="18"/>
+              </w:rPr>
+              <w:t>25 Oct 2026</w:t>
+            </w:r>
+          </w:p>
+        </w:tc>
+        <w:tc>
+          <w:tcPr>
+            <w:tcW w:type="dxa" w:w="3118"/>
+            <w:vAlign w:val="center"/>
+          </w:tcPr>
+          <w:p>
+            <w:pPr>
+              <w:keepNext w:val="0"/>
+              <w:spacing w:after="40" w:line="240" w:lineRule="auto"/>
+            </w:pPr>
+            <w:r>
+              <w:rPr>
+                <w:rFonts w:ascii="Arial" w:hAnsi="Arial"/>
+                <w:color w:val="000000"/>
+                <w:sz w:val="18"/>
+              </w:rPr>
+              <w:t>22:00–00:00</w:t>
+            </w:r>
+          </w:p>
+        </w:tc>
+        <w:tc>
+          <w:tcPr>
+            <w:tcW w:type="dxa" w:w="2268"/>
+            <w:vAlign w:val="center"/>
+          </w:tcPr>
+          <w:p>
+            <w:pPr>
+              <w:keepNext w:val="0"/>
+              <w:spacing w:after="40" w:line="240" w:lineRule="auto"/>
+            </w:pPr>
+            <w:r>
+              <w:rPr>
+                <w:rFonts w:ascii="Arial" w:hAnsi="Arial"/>
+                <w:color w:val="000000"/>
+                <w:sz w:val="18"/>
+              </w:rPr>
+              <w:t>offpeak</w:t>
+            </w:r>
+          </w:p>
+        </w:tc>
+        <w:tc>
+          <w:tcPr>
+            <w:tcW w:type="dxa" w:w="1701"/>
+            <w:vAlign w:val="center"/>
+          </w:tcPr>
+          <w:p>
+            <w:pPr>
+              <w:keepNext w:val="0"/>
+              <w:spacing w:after="40" w:line="240" w:lineRule="auto"/>
+            </w:pPr>
+            <w:r>
+              <w:rPr>
+                <w:rFonts w:ascii="Arial" w:hAnsi="Arial"/>
+                <w:color w:val="000000"/>
+                <w:sz w:val="18"/>
+              </w:rPr>
+              <w:t>20</w:t>
+            </w:r>
+          </w:p>
+        </w:tc>
+      </w:tr>
+    </w:tbl>
+    <w:p>
+      <w:pPr>
+        <w:spacing w:after="20"/>
+      </w:pPr>
+    </w:p>
+    <w:p>
+      <w:pPr>
+        <w:widowControl/>
+      </w:pPr>
+      <w:r>
+        <w:rPr>
+          <w:rFonts w:ascii="Arial" w:hAnsi="Arial"/>
+          <w:color w:val="000000"/>
+        </w:rPr>
+        <w:t>One prospective batch of 20 pairs is eligible in each window, at the first available worker check; the total cap is 100 further Google requests. Actual timestamps determine coverage. Missed windows are not backfilled. Planning a batch does not count it as observed; actual counts appear in Segment 4.</w:t>
+      </w:r>
+    </w:p>
+    <w:p>
+      <w:pPr>
+        <w:widowControl/>
+      </w:pPr>
+      <w:r>
+        <w:rPr>
+          <w:rFonts w:ascii="Arial" w:hAnsi="Arial"/>
+          <w:color w:val="000000"/>
+        </w:rPr>
+        <w:t xml:space="preserve">Amended protocol and storage rules: </w:t>
+      </w:r>
+      <w:hyperlink r:id="rId14">
+        <w:r>
+          <w:rPr>
+            <w:color w:val="174B76"/>
+            <w:sz w:val="18"/>
+          </w:rPr>
+          <w:t>https://github.com/SuperFlyTK/rmt-a3-travel-time-astana/blob/main/docs/google_followup_protocol.json</w:t>
+        </w:r>
+      </w:hyperlink>
+    </w:p>
     <w:p>
       <w:pPr>
         <w:pStyle w:val="Heading2"/>
@@ -1675,7 +2272,7 @@
           <w:rFonts w:ascii="Arial" w:hAnsi="Arial"/>
           <w:color w:val="000000"/>
         </w:rPr>
-        <w:t>First, the team reviewed the earlier assignments, checked credential access with public example coordinates and separated those tests from research data. Second, it inspected provider documentation and publication terms. This led to disabling the traffic-provider adapters before the research collection. Third, route definitions, period rules and expectations were fixed on 24.10.2026. Fourth, the ORS collector recorded the pilot requests using a schema that also records unsuccessful attempts. Fifth, the processing script produced an audited working file, coverage tables and the original figures below. The journal identifies the operator and any later changes.</w:t>
+        <w:t>First, the team reviewed earlier assignments and separated credential checks from research data. Second, it inspected documentation and publication terms, then disabled the original TomTom and 2GIS adapters. Third, route definitions, period rules and expectations were fixed on 24.10.2026. Fourth, the ORS collector recorded pilot requests and unsuccessful attempts. Fifth, processing produced an audited working file, coverage tables and original figures. The journal identifies the operator and later changes.</w:t>
       </w:r>
     </w:p>
     <w:p>
@@ -1724,7 +2321,7 @@
                     <pic:cNvPicPr/>
                   </pic:nvPicPr>
                   <pic:blipFill>
-                    <a:blip r:embed="rId14"/>
+                    <a:blip r:embed="rId15"/>
                     <a:stretch>
                       <a:fillRect/>
                     </a:stretch>
@@ -1790,7 +2387,7 @@
                     <pic:cNvPicPr/>
                   </pic:nvPicPr>
                   <pic:blipFill>
-                    <a:blip r:embed="rId15"/>
+                    <a:blip r:embed="rId16"/>
                     <a:stretch>
                       <a:fillRect/>
                     </a:stretch>
@@ -1856,7 +2453,7 @@
                     <pic:cNvPicPr/>
                   </pic:nvPicPr>
                   <pic:blipFill>
-                    <a:blip r:embed="rId16"/>
+                    <a:blip r:embed="rId17"/>
                     <a:stretch>
                       <a:fillRect/>
                     </a:stretch>
@@ -1922,7 +2519,7 @@
                     <pic:cNvPicPr/>
                   </pic:nvPicPr>
                   <pic:blipFill>
-                    <a:blip r:embed="rId17"/>
+                    <a:blip r:embed="rId18"/>
                     <a:stretch>
                       <a:fillRect/>
                     </a:stretch>
@@ -1975,7 +2572,7 @@
       <w:r>
         <w:drawing>
           <wp:inline xmlns:a="http://schemas.openxmlformats.org/drawingml/2006/main" xmlns:pic="http://schemas.openxmlformats.org/drawingml/2006/picture">
-            <wp:extent cx="5976000" cy="3318070"/>
+            <wp:extent cx="5976000" cy="3322900"/>
             <wp:docPr id="5" name="Picture 5" descr="Recorded API request latencies by request start time. Latency is instrument performance and is distinct from estimated journey duration. Failed requests remain eligible if their timing was recorded." title="Figure 5"/>
             <wp:cNvGraphicFramePr>
               <a:graphicFrameLocks noChangeAspect="1"/>
@@ -1988,7 +2585,7 @@
                     <pic:cNvPicPr/>
                   </pic:nvPicPr>
                   <pic:blipFill>
-                    <a:blip r:embed="rId18"/>
+                    <a:blip r:embed="rId19"/>
                     <a:stretch>
                       <a:fillRect/>
                     </a:stretch>
@@ -1996,7 +2593,7 @@
                   <pic:spPr>
                     <a:xfrm>
                       <a:off x="0" y="0"/>
-                      <a:ext cx="5976000" cy="3318070"/>
+                      <a:ext cx="5976000" cy="3322900"/>
                     </a:xfrm>
                     <a:prstGeom prst="rect"/>
                   </pic:spPr>
@@ -2054,7 +2651,7 @@
                     <pic:cNvPicPr/>
                   </pic:nvPicPr>
                   <pic:blipFill>
-                    <a:blip r:embed="rId19"/>
+                    <a:blip r:embed="rId20"/>
                     <a:stretch>
                       <a:fillRect/>
                     </a:stretch>
@@ -2120,7 +2717,7 @@
                     <pic:cNvPicPr/>
                   </pic:nvPicPr>
                   <pic:blipFill>
-                    <a:blip r:embed="rId20"/>
+                    <a:blip r:embed="rId21"/>
                     <a:stretch>
                       <a:fillRect/>
                     </a:stretch>
@@ -2186,7 +2783,7 @@
                     <pic:cNvPicPr/>
                   </pic:nvPicPr>
                   <pic:blipFill>
-                    <a:blip r:embed="rId21"/>
+                    <a:blip r:embed="rId22"/>
                     <a:stretch>
                       <a:fillRect/>
                     </a:stretch>
@@ -2252,7 +2849,7 @@
                     <pic:cNvPicPr/>
                   </pic:nvPicPr>
                   <pic:blipFill>
-                    <a:blip r:embed="rId22"/>
+                    <a:blip r:embed="rId23"/>
                     <a:stretch>
                       <a:fillRect/>
                     </a:stretch>
@@ -2318,7 +2915,7 @@
                     <pic:cNvPicPr/>
                   </pic:nvPicPr>
                   <pic:blipFill>
-                    <a:blip r:embed="rId23"/>
+                    <a:blip r:embed="rId24"/>
                     <a:stretch>
                       <a:fillRect/>
                     </a:stretch>
@@ -2352,6 +2949,577 @@
     </w:p>
     <w:p>
       <w:pPr>
+        <w:widowControl/>
+      </w:pPr>
+      <w:r>
+        <w:rPr>
+          <w:rFonts w:ascii="Arial" w:hAnsi="Arial"/>
+          <w:color w:val="000000"/>
+        </w:rPr>
+        <w:t>A separate protocol was recorded at 2026-10-24T11:24:15.506607+00:00, after a successful Google Demo credential check and before the exploratory cycle. It paired the same public endpoints with Google TRAFFIC_AWARE_OPTIMAL and the ORS control. Requests ran concurrently, with a maximum permitted start gap of 60 seconds. The bounded cycle is descriptive; its 20 valid pairs are separate from the 68-record ORS snapshot and do not enter the primary expected-results tests.</w:t>
+      </w:r>
+    </w:p>
+    <w:p>
+      <w:pPr>
+        <w:widowControl/>
+      </w:pPr>
+      <w:r>
+        <w:rPr>
+          <w:rFonts w:ascii="Arial" w:hAnsi="Arial"/>
+          <w:color w:val="000000"/>
+        </w:rPr>
+        <w:t>Local cycle: 24 October 2026 16:24:54 to 16:25:36 (Asia/Almaty); classified period: other.</w:t>
+      </w:r>
+    </w:p>
+    <w:tbl>
+      <w:tblPr>
+        <w:tblW w:type="auto" w:w="0"/>
+        <w:jc w:val="center"/>
+        <w:tblLayout w:type="fixed"/>
+        <w:tblLook w:firstColumn="1" w:firstRow="1" w:lastColumn="0" w:lastRow="0" w:noHBand="0" w:noVBand="1" w:val="04A0"/>
+        <w:tblBorders>
+          <w:top w:val="single" w:sz="4" w:color="B8B8B8"/>
+          <w:left w:val="single" w:sz="4" w:color="B8B8B8"/>
+          <w:bottom w:val="single" w:sz="4" w:color="B8B8B8"/>
+          <w:right w:val="single" w:sz="4" w:color="B8B8B8"/>
+          <w:insideH w:val="single" w:sz="4" w:color="B8B8B8"/>
+          <w:insideV w:val="single" w:sz="4" w:color="B8B8B8"/>
+        </w:tblBorders>
+        <w:tblCellMar>
+          <w:top w:w="80" w:type="dxa"/>
+          <w:bottom w:w="80" w:type="dxa"/>
+          <w:left w:w="80" w:type="dxa"/>
+          <w:right w:w="80" w:type="dxa"/>
+        </w:tblCellMar>
+      </w:tblPr>
+      <w:tblGrid>
+        <w:gridCol w:w="3402"/>
+        <w:gridCol w:w="6236"/>
+      </w:tblGrid>
+      <w:tr>
+        <w:trPr>
+          <w:tblHeader/>
+          <w:cantSplit/>
+        </w:trPr>
+        <w:tc>
+          <w:tcPr>
+            <w:tcW w:type="dxa" w:w="3402"/>
+            <w:vAlign w:val="center"/>
+            <w:shd w:fill="EAEAEA"/>
+          </w:tcPr>
+          <w:p>
+            <w:pPr>
+              <w:keepNext/>
+              <w:spacing w:after="40" w:line="240" w:lineRule="auto"/>
+            </w:pPr>
+            <w:r>
+              <w:rPr>
+                <w:rFonts w:ascii="Arial" w:hAnsi="Arial"/>
+                <w:b/>
+                <w:color w:val="000000"/>
+                <w:sz w:val="18"/>
+              </w:rPr>
+              <w:t>Exploratory aggregate</w:t>
+            </w:r>
+          </w:p>
+        </w:tc>
+        <w:tc>
+          <w:tcPr>
+            <w:tcW w:type="dxa" w:w="6236"/>
+            <w:vAlign w:val="center"/>
+            <w:shd w:fill="EAEAEA"/>
+          </w:tcPr>
+          <w:p>
+            <w:pPr>
+              <w:keepNext/>
+              <w:spacing w:after="40" w:line="240" w:lineRule="auto"/>
+            </w:pPr>
+            <w:r>
+              <w:rPr>
+                <w:rFonts w:ascii="Arial" w:hAnsi="Arial"/>
+                <w:b/>
+                <w:color w:val="000000"/>
+                <w:sz w:val="18"/>
+              </w:rPr>
+              <w:t>Recorded result</w:t>
+            </w:r>
+          </w:p>
+        </w:tc>
+      </w:tr>
+      <w:tr>
+        <w:trPr>
+          <w:cantSplit/>
+        </w:trPr>
+        <w:tc>
+          <w:tcPr>
+            <w:tcW w:type="dxa" w:w="3402"/>
+            <w:vAlign w:val="center"/>
+          </w:tcPr>
+          <w:p>
+            <w:pPr>
+              <w:keepNext/>
+              <w:spacing w:after="40" w:line="240" w:lineRule="auto"/>
+            </w:pPr>
+            <w:r>
+              <w:rPr>
+                <w:rFonts w:ascii="Arial" w:hAnsi="Arial"/>
+                <w:color w:val="000000"/>
+                <w:sz w:val="18"/>
+              </w:rPr>
+              <w:t>Attempted / valid pairs</w:t>
+            </w:r>
+          </w:p>
+        </w:tc>
+        <w:tc>
+          <w:tcPr>
+            <w:tcW w:type="dxa" w:w="6236"/>
+            <w:vAlign w:val="center"/>
+          </w:tcPr>
+          <w:p>
+            <w:pPr>
+              <w:keepNext/>
+              <w:spacing w:after="40" w:line="240" w:lineRule="auto"/>
+            </w:pPr>
+            <w:r>
+              <w:rPr>
+                <w:rFonts w:ascii="Arial" w:hAnsi="Arial"/>
+                <w:color w:val="000000"/>
+                <w:sz w:val="18"/>
+              </w:rPr>
+              <w:t>20 / 20; successful Google responses 20, ORS responses 20</w:t>
+            </w:r>
+          </w:p>
+        </w:tc>
+      </w:tr>
+      <w:tr>
+        <w:trPr>
+          <w:cantSplit/>
+        </w:trPr>
+        <w:tc>
+          <w:tcPr>
+            <w:tcW w:type="dxa" w:w="3402"/>
+            <w:vAlign w:val="center"/>
+          </w:tcPr>
+          <w:p>
+            <w:pPr>
+              <w:keepNext/>
+              <w:spacing w:after="40" w:line="240" w:lineRule="auto"/>
+            </w:pPr>
+            <w:r>
+              <w:rPr>
+                <w:rFonts w:ascii="Arial" w:hAnsi="Arial"/>
+                <w:color w:val="000000"/>
+                <w:sz w:val="18"/>
+              </w:rPr>
+              <w:t>Cycle interval (UTC)</w:t>
+            </w:r>
+          </w:p>
+        </w:tc>
+        <w:tc>
+          <w:tcPr>
+            <w:tcW w:type="dxa" w:w="6236"/>
+            <w:vAlign w:val="center"/>
+          </w:tcPr>
+          <w:p>
+            <w:pPr>
+              <w:keepNext/>
+              <w:spacing w:after="40" w:line="240" w:lineRule="auto"/>
+            </w:pPr>
+            <w:r>
+              <w:rPr>
+                <w:rFonts w:ascii="Arial" w:hAnsi="Arial"/>
+                <w:color w:val="000000"/>
+                <w:sz w:val="18"/>
+              </w:rPr>
+              <w:t>2026-10-24T11:24:54.664964+00:00</w:t>
+              <w:br/>
+              <w:t>to 2026-10-24T11:25:36.748530+00:00</w:t>
+            </w:r>
+          </w:p>
+        </w:tc>
+      </w:tr>
+      <w:tr>
+        <w:trPr>
+          <w:cantSplit/>
+        </w:trPr>
+        <w:tc>
+          <w:tcPr>
+            <w:tcW w:type="dxa" w:w="3402"/>
+            <w:vAlign w:val="center"/>
+          </w:tcPr>
+          <w:p>
+            <w:pPr>
+              <w:keepNext/>
+              <w:spacing w:after="40" w:line="240" w:lineRule="auto"/>
+            </w:pPr>
+            <w:r>
+              <w:rPr>
+                <w:rFonts w:ascii="Arial" w:hAnsi="Arial"/>
+                <w:color w:val="000000"/>
+                <w:sz w:val="18"/>
+              </w:rPr>
+              <w:t>Largest request-start gap</w:t>
+            </w:r>
+          </w:p>
+        </w:tc>
+        <w:tc>
+          <w:tcPr>
+            <w:tcW w:type="dxa" w:w="6236"/>
+            <w:vAlign w:val="center"/>
+          </w:tcPr>
+          <w:p>
+            <w:pPr>
+              <w:keepNext/>
+              <w:spacing w:after="40" w:line="240" w:lineRule="auto"/>
+            </w:pPr>
+            <w:r>
+              <w:rPr>
+                <w:rFonts w:ascii="Arial" w:hAnsi="Arial"/>
+                <w:color w:val="000000"/>
+                <w:sz w:val="18"/>
+              </w:rPr>
+              <w:t>0.032 s</w:t>
+            </w:r>
+          </w:p>
+        </w:tc>
+      </w:tr>
+      <w:tr>
+        <w:trPr>
+          <w:cantSplit/>
+        </w:trPr>
+        <w:tc>
+          <w:tcPr>
+            <w:tcW w:type="dxa" w:w="3402"/>
+            <w:vAlign w:val="center"/>
+          </w:tcPr>
+          <w:p>
+            <w:pPr>
+              <w:keepNext/>
+              <w:spacing w:after="40" w:line="240" w:lineRule="auto"/>
+            </w:pPr>
+            <w:r>
+              <w:rPr>
+                <w:rFonts w:ascii="Arial" w:hAnsi="Arial"/>
+                <w:color w:val="000000"/>
+                <w:sz w:val="18"/>
+              </w:rPr>
+              <w:t>Median signed / absolute difference</w:t>
+            </w:r>
+          </w:p>
+        </w:tc>
+        <w:tc>
+          <w:tcPr>
+            <w:tcW w:type="dxa" w:w="6236"/>
+            <w:vAlign w:val="center"/>
+          </w:tcPr>
+          <w:p>
+            <w:pPr>
+              <w:keepNext/>
+              <w:spacing w:after="40" w:line="240" w:lineRule="auto"/>
+            </w:pPr>
+            <w:r>
+              <w:rPr>
+                <w:rFonts w:ascii="Arial" w:hAnsi="Arial"/>
+                <w:color w:val="000000"/>
+                <w:sz w:val="18"/>
+              </w:rPr>
+              <w:t>730.5 / 730.5 s; signed = Google minus ORS</w:t>
+            </w:r>
+          </w:p>
+        </w:tc>
+      </w:tr>
+      <w:tr>
+        <w:trPr>
+          <w:cantSplit/>
+        </w:trPr>
+        <w:tc>
+          <w:tcPr>
+            <w:tcW w:type="dxa" w:w="3402"/>
+            <w:vAlign w:val="center"/>
+          </w:tcPr>
+          <w:p>
+            <w:pPr>
+              <w:keepNext/>
+              <w:spacing w:after="40" w:line="240" w:lineRule="auto"/>
+            </w:pPr>
+            <w:r>
+              <w:rPr>
+                <w:rFonts w:ascii="Arial" w:hAnsi="Arial"/>
+                <w:color w:val="000000"/>
+                <w:sz w:val="18"/>
+              </w:rPr>
+              <w:t>MAE / RMSE as disagreement</w:t>
+            </w:r>
+          </w:p>
+        </w:tc>
+        <w:tc>
+          <w:tcPr>
+            <w:tcW w:type="dxa" w:w="6236"/>
+            <w:vAlign w:val="center"/>
+          </w:tcPr>
+          <w:p>
+            <w:pPr>
+              <w:keepNext/>
+              <w:spacing w:after="40" w:line="240" w:lineRule="auto"/>
+            </w:pPr>
+            <w:r>
+              <w:rPr>
+                <w:rFonts w:ascii="Arial" w:hAnsi="Arial"/>
+                <w:color w:val="000000"/>
+                <w:sz w:val="18"/>
+              </w:rPr>
+              <w:t>741.72 / 783.63 s</w:t>
+            </w:r>
+          </w:p>
+        </w:tc>
+      </w:tr>
+      <w:tr>
+        <w:trPr>
+          <w:cantSplit/>
+        </w:trPr>
+        <w:tc>
+          <w:tcPr>
+            <w:tcW w:type="dxa" w:w="3402"/>
+            <w:vAlign w:val="center"/>
+          </w:tcPr>
+          <w:p>
+            <w:pPr>
+              <w:keepNext/>
+              <w:spacing w:after="40" w:line="240" w:lineRule="auto"/>
+            </w:pPr>
+            <w:r>
+              <w:rPr>
+                <w:rFonts w:ascii="Arial" w:hAnsi="Arial"/>
+                <w:color w:val="000000"/>
+                <w:sz w:val="18"/>
+              </w:rPr>
+              <w:t>Mean symmetric absolute difference</w:t>
+            </w:r>
+          </w:p>
+        </w:tc>
+        <w:tc>
+          <w:tcPr>
+            <w:tcW w:type="dxa" w:w="6236"/>
+            <w:vAlign w:val="center"/>
+          </w:tcPr>
+          <w:p>
+            <w:pPr>
+              <w:keepNext/>
+              <w:spacing w:after="40" w:line="240" w:lineRule="auto"/>
+            </w:pPr>
+            <w:r>
+              <w:rPr>
+                <w:rFonts w:ascii="Arial" w:hAnsi="Arial"/>
+                <w:color w:val="000000"/>
+                <w:sz w:val="18"/>
+              </w:rPr>
+              <w:t>57.58%</w:t>
+            </w:r>
+          </w:p>
+        </w:tc>
+      </w:tr>
+      <w:tr>
+        <w:trPr>
+          <w:cantSplit/>
+        </w:trPr>
+        <w:tc>
+          <w:tcPr>
+            <w:tcW w:type="dxa" w:w="3402"/>
+            <w:vAlign w:val="center"/>
+          </w:tcPr>
+          <w:p>
+            <w:pPr>
+              <w:keepNext/>
+              <w:spacing w:after="40" w:line="240" w:lineRule="auto"/>
+            </w:pPr>
+            <w:r>
+              <w:rPr>
+                <w:rFonts w:ascii="Arial" w:hAnsi="Arial"/>
+                <w:color w:val="000000"/>
+                <w:sz w:val="18"/>
+              </w:rPr>
+              <w:t>IQR of signed differences</w:t>
+            </w:r>
+          </w:p>
+        </w:tc>
+        <w:tc>
+          <w:tcPr>
+            <w:tcW w:type="dxa" w:w="6236"/>
+            <w:vAlign w:val="center"/>
+          </w:tcPr>
+          <w:p>
+            <w:pPr>
+              <w:keepNext/>
+              <w:spacing w:after="40" w:line="240" w:lineRule="auto"/>
+            </w:pPr>
+            <w:r>
+              <w:rPr>
+                <w:rFonts w:ascii="Arial" w:hAnsi="Arial"/>
+                <w:color w:val="000000"/>
+                <w:sz w:val="18"/>
+              </w:rPr>
+              <w:t>270.2 s</w:t>
+            </w:r>
+          </w:p>
+        </w:tc>
+      </w:tr>
+      <w:tr>
+        <w:trPr>
+          <w:cantSplit/>
+        </w:trPr>
+        <w:tc>
+          <w:tcPr>
+            <w:tcW w:type="dxa" w:w="3402"/>
+            <w:vAlign w:val="center"/>
+          </w:tcPr>
+          <w:p>
+            <w:pPr>
+              <w:keepNext w:val="0"/>
+              <w:spacing w:after="40" w:line="240" w:lineRule="auto"/>
+            </w:pPr>
+            <w:r>
+              <w:rPr>
+                <w:rFonts w:ascii="Arial" w:hAnsi="Arial"/>
+                <w:color w:val="000000"/>
+                <w:sz w:val="18"/>
+              </w:rPr>
+              <w:t>Lengths within 5% of pair mean</w:t>
+            </w:r>
+          </w:p>
+        </w:tc>
+        <w:tc>
+          <w:tcPr>
+            <w:tcW w:type="dxa" w:w="6236"/>
+            <w:vAlign w:val="center"/>
+          </w:tcPr>
+          <w:p>
+            <w:pPr>
+              <w:keepNext w:val="0"/>
+              <w:spacing w:after="40" w:line="240" w:lineRule="auto"/>
+            </w:pPr>
+            <w:r>
+              <w:rPr>
+                <w:rFonts w:ascii="Arial" w:hAnsi="Arial"/>
+                <w:color w:val="000000"/>
+                <w:sz w:val="18"/>
+              </w:rPr>
+              <w:t>15 pairs (75%); not proof of identical paths</w:t>
+            </w:r>
+          </w:p>
+        </w:tc>
+      </w:tr>
+    </w:tbl>
+    <w:p>
+      <w:pPr>
+        <w:spacing w:after="20"/>
+      </w:pPr>
+    </w:p>
+    <w:p>
+      <w:pPr>
+        <w:widowControl/>
+      </w:pPr>
+      <w:r>
+        <w:rPr>
+          <w:rFonts w:ascii="Arial" w:hAnsi="Arial"/>
+          <w:color w:val="000000"/>
+        </w:rPr>
+        <w:t xml:space="preserve">Protocol: </w:t>
+      </w:r>
+      <w:hyperlink r:id="rId25">
+        <w:r>
+          <w:rPr>
+            <w:color w:val="174B76"/>
+            <w:sz w:val="18"/>
+          </w:rPr>
+          <w:t>https://github.com/SuperFlyTK/rmt-a3-travel-time-astana/blob/main/docs/google_control_protocol.json</w:t>
+        </w:r>
+      </w:hyperlink>
+      <w:r>
+        <w:rPr>
+          <w:rFonts w:ascii="Arial" w:hAnsi="Arial"/>
+          <w:color w:val="000000"/>
+        </w:rPr>
+        <w:br/>
+        <w:t xml:space="preserve">Aggregate evidence: </w:t>
+      </w:r>
+      <w:hyperlink r:id="rId26">
+        <w:r>
+          <w:rPr>
+            <w:color w:val="174B76"/>
+            <w:sz w:val="18"/>
+          </w:rPr>
+          <w:t>https://github.com/SuperFlyTK/rmt-a3-travel-time-astana/blob/main/results/google_control_benchmark.csv</w:t>
+        </w:r>
+      </w:hyperlink>
+    </w:p>
+    <w:p>
+      <w:pPr>
+        <w:keepNext/>
+        <w:widowControl/>
+      </w:pPr>
+      <w:r>
+        <w:rPr>
+          <w:rFonts w:ascii="Arial" w:hAnsi="Arial"/>
+          <w:color w:val="000000"/>
+        </w:rPr>
+        <w:t>Figure 11 summarizes the separate Google–ORS instrument comparison using aggregate metrics only.</w:t>
+      </w:r>
+    </w:p>
+    <w:p>
+      <w:pPr>
+        <w:keepNext/>
+        <w:jc w:val="center"/>
+      </w:pPr>
+      <w:r>
+        <w:drawing>
+          <wp:inline xmlns:a="http://schemas.openxmlformats.org/drawingml/2006/main" xmlns:pic="http://schemas.openxmlformats.org/drawingml/2006/picture">
+            <wp:extent cx="5976000" cy="3374949"/>
+            <wp:docPr id="11" name="Picture 11" descr="Original aggregate disagreement metrics for one separate exploratory cycle. Google used TRAFFIC_AWARE_OPTIMAL; ORS has no live traffic. These are not accuracy measures or the primary peak-period comparison." title="Figure 11"/>
+            <wp:cNvGraphicFramePr>
+              <a:graphicFrameLocks noChangeAspect="1"/>
+            </wp:cNvGraphicFramePr>
+            <a:graphic>
+              <a:graphicData uri="http://schemas.openxmlformats.org/drawingml/2006/picture">
+                <pic:pic>
+                  <pic:nvPicPr>
+                    <pic:cNvPr id="0" name="google_control_benchmark.png"/>
+                    <pic:cNvPicPr/>
+                  </pic:nvPicPr>
+                  <pic:blipFill>
+                    <a:blip r:embed="rId27"/>
+                    <a:stretch>
+                      <a:fillRect/>
+                    </a:stretch>
+                  </pic:blipFill>
+                  <pic:spPr>
+                    <a:xfrm>
+                      <a:off x="0" y="0"/>
+                      <a:ext cx="5976000" cy="3374949"/>
+                    </a:xfrm>
+                    <a:prstGeom prst="rect"/>
+                  </pic:spPr>
+                </pic:pic>
+              </a:graphicData>
+            </a:graphic>
+          </wp:inline>
+        </w:drawing>
+      </w:r>
+    </w:p>
+    <w:p>
+      <w:pPr>
+        <w:pStyle w:val="Caption"/>
+        <w:widowControl/>
+      </w:pPr>
+      <w:r>
+        <w:rPr>
+          <w:rFonts w:ascii="Arial" w:hAnsi="Arial"/>
+          <w:color w:val="000000"/>
+        </w:rPr>
+        <w:t>Figure 11. Original aggregate disagreement metrics for one separate exploratory cycle. Google used TRAFFIC_AWARE_OPTIMAL; ORS has no live traffic. These are not accuracy measures or the primary peak-period comparison. Source: results/google_control_benchmark.csv. Team-computed comparative-test results; ORS control: © openrouteservice by HeiGIT | Data from OpenStreetMap.</w:t>
+      </w:r>
+    </w:p>
+    <w:p>
+      <w:pPr>
         <w:pStyle w:val="Heading2"/>
       </w:pPr>
       <w:r>
@@ -2368,6 +3536,18 @@
           <w:color w:val="000000"/>
         </w:rPr>
         <w:t>No human participant supplies a personal journey or identity, so participant consent is not applicable to this public-coordinate instrument. API access still has contractual conditions. Technical success was insufficient to authorize a public comparison: TomTom requires written approval for benchmarking, while the applicable 2GIS Kazakhstan demo redistribution terms remain unresolved. ORS results are shared under current CC BY-SA terms with attribution. Secrets remain outside version control. The team retains failed requests and exclusion reasons to make limitations visible, while avoiding account identifiers and credential-bearing URLs in public evidence.</w:t>
+      </w:r>
+    </w:p>
+    <w:p>
+      <w:pPr>
+        <w:widowControl/>
+      </w:pPr>
+      <w:r>
+        <w:rPr>
+          <w:rFonts w:ascii="Arial" w:hAnsi="Arial"/>
+          <w:color w:val="000000"/>
+        </w:rPr>
+        <w:t>Google terms address publication of comparative-test results in section 3.2.4 and separately restrict storage of Maps content in section 3.2.3. The exploratory protocol therefore processes Google values transiently and publishes original aggregate metrics, status records and request methods. Individual Google estimates and geometry are not retained. Those aggregates cannot be recalculated from saved Google responses; repeating the protocol samples new live outputs.</w:t>
       </w:r>
     </w:p>
     <w:tbl>
@@ -2694,6 +3874,18 @@
           <w:color w:val="000000"/>
         </w:rPr>
         <w:t>The expectation record is fixed before the first research observation. Earlier credential checks established access only and did not supply Astana outcomes. Expectations about provider disagreement remain unchanged when collection becomes restricted. Instrument expectations are separately falsifiable through valid-response counts, latency and route coverage. The six scenarios describe possible outcomes rather than simulated findings. A later amendment must carry its own date and reason; it cannot silently replace the existing thresholds after results become visible. Objectives retain the earlier project sequence, which Assignment 2 did not separately renumber.</w:t>
+      </w:r>
+    </w:p>
+    <w:p>
+      <w:pPr>
+        <w:widowControl/>
+      </w:pPr>
+      <w:r>
+        <w:rPr>
+          <w:rFonts w:ascii="Arial" w:hAnsi="Arial"/>
+          <w:color w:val="000000"/>
+        </w:rPr>
+        <w:t>The table below preserves the original expected-results wording. ER1–ER4 concern the initial TomTom–2GIS design and are not directly tested by Google–ORS control data. ER5–ER8 still describe the recorded ORS instrument. The dated amendment gives a separate descriptive expectation: Peak-window median absolute Google-ORS disagreement will exceed off-peak-window median absolute disagreement. The earlier 1.5 ratio is retained as a prospective descriptive reference, not a revised original ER.</w:t>
       </w:r>
     </w:p>
     <w:tbl>
@@ -4172,7 +5364,7 @@
                 <w:color w:val="000000"/>
                 <w:sz w:val="18"/>
               </w:rPr>
-              <w:t>Primary expectation: larger median absolute disagreement during evening peak. Instrument expectations: &lt;2% invalid routes, ≥95% requests within 10 s, all 20 pilot routes represented. Missing optional baselines, failed responses, duplicates and implausible implied speeds are recorded. API agreement cannot establish actual travel-time accuracy.</w:t>
+              <w:t>Current descriptive expectation: larger per-window median absolute Google–ORS disagreement during peak; the initial 1.5 ratio is a prospective reference, not a rewritten ER. No route/day significance test is supported by aggregate-only Google retention. Instrument expectations: &lt;2% invalid routes, ≥95% requests within 10 s, all 20 pilot routes represented. Missing optional baselines, failed responses, duplicates and implausible implied speeds are recorded. API agreement cannot establish actual travel-time accuracy.</w:t>
             </w:r>
           </w:p>
         </w:tc>
@@ -5260,11 +6452,9 @@
                 <w:color w:val="000000"/>
                 <w:sz w:val="18"/>
               </w:rPr>
-              <w:t>How do TomTom and 2GIS traffic-aware travel-time estimates diverge on fixed Astana routes during evening peak compared with off-peak periods?</w:t>
+              <w:t>How do Google traffic-aware travel-time estimates differ from ORS control estimates on fixed Astana routes during peak and off-peak periods?</w:t>
               <w:br/>
-              <w:t>H1: The magnitude of provider disagreement is greater during evening peak than off-peak periods.</w:t>
-              <w:br/>
-              <w:t>H0: The magnitude of provider disagreement does not differ between periods.</w:t>
+              <w:t>Descriptive expectation: Peak-window median absolute Google-ORS disagreement will exceed off-peak-window median absolute disagreement. The earlier 1.5 ratio is retained as a prospective descriptive reference, not a revised original ER.</w:t>
             </w:r>
           </w:p>
         </w:tc>
@@ -5309,7 +6499,7 @@
                 <w:color w:val="000000"/>
                 <w:sz w:val="18"/>
               </w:rPr>
-              <w:t>Observational repeated secondary-data comparison; ORS-only instrument pilot executed</w:t>
+              <w:t>Observational repeated secondary-data comparison; ORS instrument pilot executed; separate bounded Google–ORS exploratory test</w:t>
             </w:r>
           </w:p>
         </w:tc>
@@ -5354,7 +6544,7 @@
                 <w:color w:val="000000"/>
                 <w:sz w:val="18"/>
               </w:rPr>
-              <w:t>20 fixed Astana OD routes; 64 unique ORS requests at snapshot</w:t>
+              <w:t>20 fixed Astana OD routes; 68 unique ORS requests at snapshot; 20 separate exploratory pairs</w:t>
             </w:r>
           </w:p>
         </w:tc>
@@ -5444,7 +6634,7 @@
                 <w:color w:val="000000"/>
                 <w:sz w:val="18"/>
               </w:rPr>
-              <w:t>HTTP requests with timeout and no redirects; recorded errors; immutable raw inputs</w:t>
+              <w:t>HTTP requests with timeout and no redirects; recorded errors; immutable licensed raw inputs</w:t>
             </w:r>
           </w:p>
         </w:tc>
@@ -5489,7 +6679,7 @@
                 <w:color w:val="000000"/>
                 <w:sz w:val="18"/>
               </w:rPr>
-              <w:t>Validation, missingness and descriptive instrument summaries; paired metrics defined prospectively</w:t>
+              <w:t>ORS validation and missingness; descriptive per-window Google–ORS aggregate comparisons; no route/day inference from aggregate-only results</w:t>
             </w:r>
           </w:p>
         </w:tc>
@@ -5534,7 +6724,7 @@
                 <w:color w:val="000000"/>
                 <w:sz w:val="18"/>
               </w:rPr>
-              <w:t>64 usable ORS observations; primary traffic comparison not performed</w:t>
+              <w:t>68 usable ORS observations; initial TomTom–2GIS comparison not performed; separate exploratory aggregate disagreement reported in Segment 1 T7</w:t>
             </w:r>
           </w:p>
         </w:tc>
@@ -5722,7 +6912,7 @@
                 <w:color w:val="000000"/>
                 <w:sz w:val="18"/>
               </w:rPr>
-              <w:t>Collector</w:t>
+              <w:t>ORS collector</w:t>
             </w:r>
           </w:p>
         </w:tc>
@@ -5762,7 +6952,7 @@
                 <w:color w:val="000000"/>
                 <w:sz w:val="18"/>
               </w:rPr>
-              <w:t>Estimates, geometry, status and timing</w:t>
+              <w:t>Licensed estimates, geometry, status and timing</w:t>
             </w:r>
           </w:p>
         </w:tc>
@@ -5776,7 +6966,7 @@
               <w:keepNext/>
               <w:spacing w:after="40" w:line="240" w:lineRule="auto"/>
             </w:pPr>
-            <w:hyperlink r:id="rId24">
+            <w:hyperlink r:id="rId28">
               <w:r>
                 <w:rPr>
                   <w:color w:val="174B76"/>
@@ -5948,7 +7138,7 @@
               <w:keepNext/>
               <w:spacing w:after="40" w:line="240" w:lineRule="auto"/>
             </w:pPr>
-            <w:hyperlink r:id="rId25">
+            <w:hyperlink r:id="rId29">
               <w:r>
                 <w:rPr>
                   <w:color w:val="174B76"/>
@@ -5971,7 +7161,7 @@
           </w:tcPr>
           <w:p>
             <w:pPr>
-              <w:keepNext w:val="0"/>
+              <w:keepNext/>
               <w:spacing w:after="40" w:line="240" w:lineRule="auto"/>
             </w:pPr>
             <w:r>
@@ -5991,7 +7181,7 @@
           </w:tcPr>
           <w:p>
             <w:pPr>
-              <w:keepNext w:val="0"/>
+              <w:keepNext/>
               <w:spacing w:after="40" w:line="240" w:lineRule="auto"/>
             </w:pPr>
             <w:r>
@@ -6011,16 +7201,16 @@
           </w:tcPr>
           <w:p>
             <w:pPr>
-              <w:keepNext w:val="0"/>
-              <w:spacing w:after="40" w:line="240" w:lineRule="auto"/>
-            </w:pPr>
-            <w:r>
-              <w:rPr>
-                <w:rFonts w:ascii="Arial" w:hAnsi="Arial"/>
-                <w:color w:val="000000"/>
-                <w:sz w:val="18"/>
-              </w:rPr>
-              <w:t>Audited observations and descriptive summaries</w:t>
+              <w:keepNext/>
+              <w:spacing w:after="40" w:line="240" w:lineRule="auto"/>
+            </w:pPr>
+            <w:r>
+              <w:rPr>
+                <w:rFonts w:ascii="Arial" w:hAnsi="Arial"/>
+                <w:color w:val="000000"/>
+                <w:sz w:val="18"/>
+              </w:rPr>
+              <w:t>Audited ORS observations and descriptive summaries</w:t>
             </w:r>
           </w:p>
         </w:tc>
@@ -6031,16 +7221,102 @@
           </w:tcPr>
           <w:p>
             <w:pPr>
-              <w:keepNext w:val="0"/>
-              <w:spacing w:after="40" w:line="240" w:lineRule="auto"/>
-            </w:pPr>
-            <w:hyperlink r:id="rId26">
+              <w:keepNext/>
+              <w:spacing w:after="40" w:line="240" w:lineRule="auto"/>
+            </w:pPr>
+            <w:hyperlink r:id="rId30">
               <w:r>
                 <w:rPr>
                   <w:color w:val="174B76"/>
                   <w:sz w:val="18"/>
                 </w:rPr>
                 <w:t>https://github.com/SuperFlyTK/rmt-a3-travel-time-astana/blob/main/analysis/process.py</w:t>
+              </w:r>
+            </w:hyperlink>
+          </w:p>
+        </w:tc>
+      </w:tr>
+      <w:tr>
+        <w:trPr>
+          <w:cantSplit/>
+        </w:trPr>
+        <w:tc>
+          <w:tcPr>
+            <w:tcW w:type="dxa" w:w="1304"/>
+            <w:vAlign w:val="center"/>
+          </w:tcPr>
+          <w:p>
+            <w:pPr>
+              <w:keepNext w:val="0"/>
+              <w:spacing w:after="40" w:line="240" w:lineRule="auto"/>
+            </w:pPr>
+            <w:r>
+              <w:rPr>
+                <w:rFonts w:ascii="Arial" w:hAnsi="Arial"/>
+                <w:color w:val="000000"/>
+                <w:sz w:val="18"/>
+              </w:rPr>
+              <w:t>Google–ORS follow-up</w:t>
+            </w:r>
+          </w:p>
+        </w:tc>
+        <w:tc>
+          <w:tcPr>
+            <w:tcW w:type="dxa" w:w="1304"/>
+            <w:vAlign w:val="center"/>
+          </w:tcPr>
+          <w:p>
+            <w:pPr>
+              <w:keepNext w:val="0"/>
+              <w:spacing w:after="40" w:line="240" w:lineRule="auto"/>
+            </w:pPr>
+            <w:r>
+              <w:rPr>
+                <w:rFonts w:ascii="Arial" w:hAnsi="Arial"/>
+                <w:color w:val="000000"/>
+                <w:sz w:val="18"/>
+              </w:rPr>
+              <w:t>Python / Actions</w:t>
+            </w:r>
+          </w:p>
+        </w:tc>
+        <w:tc>
+          <w:tcPr>
+            <w:tcW w:type="dxa" w:w="2324"/>
+            <w:vAlign w:val="center"/>
+          </w:tcPr>
+          <w:p>
+            <w:pPr>
+              <w:keepNext w:val="0"/>
+              <w:spacing w:after="40" w:line="240" w:lineRule="auto"/>
+            </w:pPr>
+            <w:r>
+              <w:rPr>
+                <w:rFonts w:ascii="Arial" w:hAnsi="Arial"/>
+                <w:color w:val="000000"/>
+                <w:sz w:val="18"/>
+              </w:rPr>
+              <w:t>One bounded batch per window; aggregate metrics and request status</w:t>
+            </w:r>
+          </w:p>
+        </w:tc>
+        <w:tc>
+          <w:tcPr>
+            <w:tcW w:type="dxa" w:w="4706"/>
+            <w:vAlign w:val="center"/>
+          </w:tcPr>
+          <w:p>
+            <w:pPr>
+              <w:keepNext w:val="0"/>
+              <w:spacing w:after="40" w:line="240" w:lineRule="auto"/>
+            </w:pPr>
+            <w:hyperlink r:id="rId31">
+              <w:r>
+                <w:rPr>
+                  <w:color w:val="174B76"/>
+                  <w:sz w:val="18"/>
+                </w:rPr>
+                <w:t>https://github.com/SuperFlyTK/rmt-a3-travel-time-astana/blob/main/collector/google_followup.py</w:t>
               </w:r>
             </w:hyperlink>
           </w:p>
@@ -6083,7 +7359,7 @@
         </w:rPr>
         <w:t xml:space="preserve">Exact snapshot reproduction uses frozen inputs rather than later arriving raw files. Follow the saved instructions and input hashes at </w:t>
       </w:r>
-      <w:hyperlink r:id="rId27">
+      <w:hyperlink r:id="rId32">
         <w:r>
           <w:rPr>
             <w:color w:val="174B76"/>
@@ -6092,6 +7368,18 @@
           <w:t>https://github.com/SuperFlyTK/rmt-a3-travel-time-astana/blob/main/docs/reproduce_report.md</w:t>
         </w:r>
       </w:hyperlink>
+    </w:p>
+    <w:p>
+      <w:pPr>
+        <w:widowControl/>
+      </w:pPr>
+      <w:r>
+        <w:rPr>
+          <w:rFonts w:ascii="Arial" w:hAnsi="Arial"/>
+          <w:color w:val="000000"/>
+        </w:rPr>
+        <w:t>The frozen ORS analysis remains independently recalculable. The separate exploratory archive contains Google request status and timestamps, ORS responses and original aggregate metrics. Its Google numerical inputs are intentionally absent, so its aggregate recalculation has a different reproducibility limit.</w:t>
+      </w:r>
     </w:p>
     <w:tbl>
       <w:tblPr>
@@ -6202,7 +7490,7 @@
               <w:keepNext/>
               <w:spacing w:after="40" w:line="240" w:lineRule="auto"/>
             </w:pPr>
-            <w:hyperlink r:id="rId28">
+            <w:hyperlink r:id="rId33">
               <w:r>
                 <w:rPr>
                   <w:color w:val="174B76"/>
@@ -6248,7 +7536,7 @@
               <w:keepNext/>
               <w:spacing w:after="40" w:line="240" w:lineRule="auto"/>
             </w:pPr>
-            <w:hyperlink r:id="rId29">
+            <w:hyperlink r:id="rId34">
               <w:r>
                 <w:rPr>
                   <w:color w:val="174B76"/>
@@ -6303,7 +7591,7 @@
               <w:keepNext/>
               <w:spacing w:after="40" w:line="240" w:lineRule="auto"/>
             </w:pPr>
-            <w:hyperlink r:id="rId30">
+            <w:hyperlink r:id="rId35">
               <w:r>
                 <w:rPr>
                   <w:color w:val="174B76"/>
@@ -6358,7 +7646,7 @@
               <w:keepNext/>
               <w:spacing w:after="40" w:line="240" w:lineRule="auto"/>
             </w:pPr>
-            <w:hyperlink r:id="rId31">
+            <w:hyperlink r:id="rId36">
               <w:r>
                 <w:rPr>
                   <w:color w:val="174B76"/>
@@ -6466,7 +7754,7 @@
                 <w:sz w:val="18"/>
               </w:rPr>
               <w:br/>
-              <w:t>Archive upload pending verification at this snapshot</w:t>
+              <w:t>Archive available; anyone with the link can read it</w:t>
             </w:r>
           </w:p>
         </w:tc>
@@ -6660,7 +7948,7 @@
               <w:keepNext/>
               <w:spacing w:after="40" w:line="240" w:lineRule="auto"/>
             </w:pPr>
-            <w:hyperlink r:id="rId32">
+            <w:hyperlink r:id="rId37">
               <w:r>
                 <w:rPr>
                   <w:color w:val="174B76"/>
@@ -6746,7 +8034,7 @@
               <w:keepNext/>
               <w:spacing w:after="40" w:line="240" w:lineRule="auto"/>
             </w:pPr>
-            <w:hyperlink r:id="rId33">
+            <w:hyperlink r:id="rId38">
               <w:r>
                 <w:rPr>
                   <w:color w:val="174B76"/>
@@ -6832,7 +8120,7 @@
               <w:keepNext/>
               <w:spacing w:after="40" w:line="240" w:lineRule="auto"/>
             </w:pPr>
-            <w:hyperlink r:id="rId34">
+            <w:hyperlink r:id="rId39">
               <w:r>
                 <w:rPr>
                   <w:color w:val="174B76"/>
@@ -6918,7 +8206,7 @@
               <w:keepNext w:val="0"/>
               <w:spacing w:after="40" w:line="240" w:lineRule="auto"/>
             </w:pPr>
-            <w:hyperlink r:id="rId35">
+            <w:hyperlink r:id="rId40">
               <w:r>
                 <w:rPr>
                   <w:color w:val="174B76"/>
@@ -7005,7 +8293,7 @@
           <w:rFonts w:ascii="Arial" w:hAnsi="Arial"/>
           <w:color w:val="000000"/>
         </w:rPr>
-        <w:t>For an eligible pair, signed difference is A minus B and absolute difference removes its direction. MAE averages absolute differences, whereas RMSE gives larger differences greater influence. Relative difference uses the pair mean as denominator, avoiding a claim that either provider is the reference truth. Quartiles describe spread. Planned uncertainty procedures preserve route clusters rather than treating repeated requests as independent. The pilot receives descriptive summaries only. With no primary pairs, disagreement statistics and peak contrasts remain unestimated, rather than being filled with zeros or inferred from ORS variability.</w:t>
+        <w:t>For an eligible pair, signed difference is A minus B and absolute difference removes its direction. MAE averages absolute differences, whereas RMSE gives larger differences greater influence. Relative difference uses the pair mean as denominator, avoiding a claim that either provider is the reference truth. Quartiles describe spread. The initial design specified route-cluster uncertainty procedures. The amended design retains only Google aggregates and therefore compares dated window summaries descriptively; it cannot reproduce the original route-by-day Wilcoxon analysis. A hundred planned requests do not become a hundred independent cases. The current other-period pilot supplies no peak-versus-off-peak contrast.</w:t>
       </w:r>
     </w:p>
     <w:tbl>
@@ -7513,7 +8801,7 @@
         </w:rPr>
         <w:t xml:space="preserve">Extraction excerpt from the saved collector; the complete request construction and error handling are at </w:t>
       </w:r>
-      <w:hyperlink r:id="rId24">
+      <w:hyperlink r:id="rId28">
         <w:r>
           <w:rPr>
             <w:color w:val="174B76"/>
@@ -7830,7 +9118,7 @@
               <w:keepNext/>
               <w:spacing w:after="40" w:line="240" w:lineRule="auto"/>
             </w:pPr>
-            <w:hyperlink r:id="rId36">
+            <w:hyperlink r:id="rId41">
               <w:r>
                 <w:rPr>
                   <w:color w:val="174B76"/>
@@ -7956,7 +9244,7 @@
               <w:keepNext/>
               <w:spacing w:after="40" w:line="240" w:lineRule="auto"/>
             </w:pPr>
-            <w:hyperlink r:id="rId37">
+            <w:hyperlink r:id="rId42">
               <w:r>
                 <w:rPr>
                   <w:color w:val="174B76"/>
@@ -8082,7 +9370,7 @@
               <w:keepNext/>
               <w:spacing w:after="40" w:line="240" w:lineRule="auto"/>
             </w:pPr>
-            <w:hyperlink r:id="rId38">
+            <w:hyperlink r:id="rId43">
               <w:r>
                 <w:rPr>
                   <w:color w:val="174B76"/>
@@ -8208,7 +9496,7 @@
               <w:keepNext/>
               <w:spacing w:after="40" w:line="240" w:lineRule="auto"/>
             </w:pPr>
-            <w:hyperlink r:id="rId39">
+            <w:hyperlink r:id="rId44">
               <w:r>
                 <w:rPr>
                   <w:color w:val="174B76"/>
@@ -8231,7 +9519,7 @@
           </w:tcPr>
           <w:p>
             <w:pPr>
-              <w:keepNext w:val="0"/>
+              <w:keepNext/>
               <w:spacing w:after="40" w:line="240" w:lineRule="auto"/>
             </w:pPr>
             <w:r>
@@ -8251,7 +9539,7 @@
           </w:tcPr>
           <w:p>
             <w:pPr>
-              <w:keepNext w:val="0"/>
+              <w:keepNext/>
               <w:spacing w:after="40" w:line="240" w:lineRule="auto"/>
             </w:pPr>
             <w:r>
@@ -8271,7 +9559,7 @@
           </w:tcPr>
           <w:p>
             <w:pPr>
-              <w:keepNext w:val="0"/>
+              <w:keepNext/>
               <w:spacing w:after="40" w:line="240" w:lineRule="auto"/>
             </w:pPr>
             <w:r>
@@ -8291,16 +9579,16 @@
           </w:tcPr>
           <w:p>
             <w:pPr>
-              <w:keepNext w:val="0"/>
-              <w:spacing w:after="40" w:line="240" w:lineRule="auto"/>
-            </w:pPr>
-            <w:r>
-              <w:rPr>
-                <w:rFonts w:ascii="Arial" w:hAnsi="Arial"/>
-                <w:color w:val="000000"/>
-                <w:sz w:val="18"/>
-              </w:rPr>
-              <w:t>2026-10-24T02:53:12.358983+00:00</w:t>
+              <w:keepNext/>
+              <w:spacing w:after="40" w:line="240" w:lineRule="auto"/>
+            </w:pPr>
+            <w:r>
+              <w:rPr>
+                <w:rFonts w:ascii="Arial" w:hAnsi="Arial"/>
+                <w:color w:val="000000"/>
+                <w:sz w:val="18"/>
+              </w:rPr>
+              <w:t>2026-10-24T11:13:51.125096+00:00</w:t>
             </w:r>
           </w:p>
         </w:tc>
@@ -8311,7 +9599,7 @@
           </w:tcPr>
           <w:p>
             <w:pPr>
-              <w:keepNext w:val="0"/>
+              <w:keepNext/>
               <w:spacing w:after="40" w:line="240" w:lineRule="auto"/>
             </w:pPr>
             <w:r>
@@ -8331,16 +9619,142 @@
           </w:tcPr>
           <w:p>
             <w:pPr>
-              <w:keepNext w:val="0"/>
-              <w:spacing w:after="40" w:line="240" w:lineRule="auto"/>
-            </w:pPr>
-            <w:hyperlink r:id="rId40">
+              <w:keepNext/>
+              <w:spacing w:after="40" w:line="240" w:lineRule="auto"/>
+            </w:pPr>
+            <w:hyperlink r:id="rId45">
               <w:r>
                 <w:rPr>
                   <w:color w:val="174B76"/>
                   <w:sz w:val="18"/>
                 </w:rPr>
                 <w:t>https://github.com/SuperFlyTK/rmt-a3-travel-time-astana/tree/main/data</w:t>
+              </w:r>
+            </w:hyperlink>
+          </w:p>
+        </w:tc>
+      </w:tr>
+      <w:tr>
+        <w:trPr>
+          <w:cantSplit/>
+        </w:trPr>
+        <w:tc>
+          <w:tcPr>
+            <w:tcW w:type="dxa" w:w="1134"/>
+            <w:vAlign w:val="center"/>
+          </w:tcPr>
+          <w:p>
+            <w:pPr>
+              <w:keepNext w:val="0"/>
+              <w:spacing w:after="40" w:line="240" w:lineRule="auto"/>
+            </w:pPr>
+            <w:r>
+              <w:rPr>
+                <w:rFonts w:ascii="Arial" w:hAnsi="Arial"/>
+                <w:color w:val="000000"/>
+                <w:sz w:val="18"/>
+              </w:rPr>
+              <w:t>Google test</w:t>
+            </w:r>
+          </w:p>
+        </w:tc>
+        <w:tc>
+          <w:tcPr>
+            <w:tcW w:type="dxa" w:w="1134"/>
+            <w:vAlign w:val="center"/>
+          </w:tcPr>
+          <w:p>
+            <w:pPr>
+              <w:keepNext w:val="0"/>
+              <w:spacing w:after="40" w:line="240" w:lineRule="auto"/>
+            </w:pPr>
+            <w:r>
+              <w:rPr>
+                <w:rFonts w:ascii="Arial" w:hAnsi="Arial"/>
+                <w:color w:val="000000"/>
+                <w:sz w:val="18"/>
+              </w:rPr>
+              <w:t>Google / project team</w:t>
+            </w:r>
+          </w:p>
+        </w:tc>
+        <w:tc>
+          <w:tcPr>
+            <w:tcW w:type="dxa" w:w="1020"/>
+            <w:vAlign w:val="center"/>
+          </w:tcPr>
+          <w:p>
+            <w:pPr>
+              <w:keepNext w:val="0"/>
+              <w:spacing w:after="40" w:line="240" w:lineRule="auto"/>
+            </w:pPr>
+            <w:r>
+              <w:rPr>
+                <w:rFonts w:ascii="Arial" w:hAnsi="Arial"/>
+                <w:color w:val="000000"/>
+                <w:sz w:val="18"/>
+              </w:rPr>
+              <w:t>24 October 2026</w:t>
+            </w:r>
+          </w:p>
+        </w:tc>
+        <w:tc>
+          <w:tcPr>
+            <w:tcW w:type="dxa" w:w="1701"/>
+            <w:vAlign w:val="center"/>
+          </w:tcPr>
+          <w:p>
+            <w:pPr>
+              <w:keepNext w:val="0"/>
+              <w:spacing w:after="40" w:line="240" w:lineRule="auto"/>
+            </w:pPr>
+            <w:r>
+              <w:rPr>
+                <w:rFonts w:ascii="Arial" w:hAnsi="Arial"/>
+                <w:color w:val="000000"/>
+                <w:sz w:val="18"/>
+              </w:rPr>
+              <w:t>Routes v2; Demo key</w:t>
+            </w:r>
+          </w:p>
+        </w:tc>
+        <w:tc>
+          <w:tcPr>
+            <w:tcW w:type="dxa" w:w="2268"/>
+            <w:vAlign w:val="center"/>
+          </w:tcPr>
+          <w:p>
+            <w:pPr>
+              <w:keepNext w:val="0"/>
+              <w:spacing w:after="40" w:line="240" w:lineRule="auto"/>
+            </w:pPr>
+            <w:r>
+              <w:rPr>
+                <w:rFonts w:ascii="Arial" w:hAnsi="Arial"/>
+                <w:color w:val="000000"/>
+                <w:sz w:val="18"/>
+              </w:rPr>
+              <w:t>Original benchmark aggregates only; no saved Google response values</w:t>
+            </w:r>
+          </w:p>
+        </w:tc>
+        <w:tc>
+          <w:tcPr>
+            <w:tcW w:type="dxa" w:w="2381"/>
+            <w:vAlign w:val="center"/>
+          </w:tcPr>
+          <w:p>
+            <w:pPr>
+              <w:keepNext w:val="0"/>
+              <w:spacing w:after="40" w:line="240" w:lineRule="auto"/>
+            </w:pPr>
+            <w:hyperlink r:id="rId46">
+              <w:r>
+                <w:rPr>
+                  <w:color w:val="174B76"/>
+                  <w:sz w:val="18"/>
+                </w:rPr>
+                <w:t>https://cloud.google.com/maps-platform/terms</w:t>
               </w:r>
             </w:hyperlink>
           </w:p>
@@ -8618,7 +10032,7 @@
                 <w:color w:val="000000"/>
                 <w:sz w:val="18"/>
               </w:rPr>
-              <w:t>0 / 0.0% (n=64)</w:t>
+              <w:t>0 / 0.0% (n=68)</w:t>
             </w:r>
           </w:p>
         </w:tc>
@@ -8725,7 +10139,7 @@
                 <w:color w:val="000000"/>
                 <w:sz w:val="18"/>
               </w:rPr>
-              <w:t>0 / 0.0% (n=64)</w:t>
+              <w:t>0 / 0.0% (n=68)</w:t>
             </w:r>
           </w:p>
         </w:tc>
@@ -8832,7 +10246,7 @@
                 <w:color w:val="000000"/>
                 <w:sz w:val="18"/>
               </w:rPr>
-              <w:t>0 / 0.0% (n=64)</w:t>
+              <w:t>0 / 0.0% (n=68)</w:t>
             </w:r>
           </w:p>
         </w:tc>
@@ -8939,7 +10353,7 @@
                 <w:color w:val="000000"/>
                 <w:sz w:val="18"/>
               </w:rPr>
-              <w:t>0 / 0.0% (n=64)</w:t>
+              <w:t>0 / 0.0% (n=68)</w:t>
             </w:r>
           </w:p>
         </w:tc>
@@ -9046,7 +10460,7 @@
                 <w:color w:val="000000"/>
                 <w:sz w:val="18"/>
               </w:rPr>
-              <w:t>0 / 0.0% (n=64)</w:t>
+              <w:t>0 / 0.0% (n=68)</w:t>
             </w:r>
           </w:p>
         </w:tc>
@@ -9153,7 +10567,7 @@
                 <w:color w:val="000000"/>
                 <w:sz w:val="18"/>
               </w:rPr>
-              <w:t>0 / 0.0% (n=64)</w:t>
+              <w:t>0 / 0.0% (n=68)</w:t>
             </w:r>
           </w:p>
         </w:tc>
@@ -9260,7 +10674,7 @@
                 <w:color w:val="000000"/>
                 <w:sz w:val="18"/>
               </w:rPr>
-              <w:t>64 / 100.0% (n=64)</w:t>
+              <w:t>68 / 100.0% (n=68)</w:t>
             </w:r>
           </w:p>
         </w:tc>
@@ -9367,7 +10781,7 @@
                 <w:color w:val="000000"/>
                 <w:sz w:val="18"/>
               </w:rPr>
-              <w:t>0 / 0.0% (n=64)</w:t>
+              <w:t>0 / 0.0% (n=68)</w:t>
             </w:r>
           </w:p>
         </w:tc>
@@ -9474,7 +10888,7 @@
                 <w:color w:val="000000"/>
                 <w:sz w:val="18"/>
               </w:rPr>
-              <w:t>0 / 0.0% (n=64)</w:t>
+              <w:t>0 / 0.0% (n=68)</w:t>
             </w:r>
           </w:p>
         </w:tc>
@@ -9581,7 +10995,7 @@
                 <w:color w:val="000000"/>
                 <w:sz w:val="18"/>
               </w:rPr>
-              <w:t>0 / 0.0% (n=64)</w:t>
+              <w:t>0 / 0.0% (n=68)</w:t>
             </w:r>
           </w:p>
         </w:tc>
@@ -9688,7 +11102,7 @@
                 <w:color w:val="000000"/>
                 <w:sz w:val="18"/>
               </w:rPr>
-              <w:t>64 / 100.0% (n=64)</w:t>
+              <w:t>68 / 100.0% (n=68)</w:t>
             </w:r>
           </w:p>
         </w:tc>
@@ -9795,7 +11209,7 @@
                 <w:color w:val="000000"/>
                 <w:sz w:val="18"/>
               </w:rPr>
-              <w:t>0 / 0.0% (n=64)</w:t>
+              <w:t>0 / 0.0% (n=68)</w:t>
             </w:r>
           </w:p>
         </w:tc>
@@ -9902,7 +11316,7 @@
                 <w:color w:val="000000"/>
                 <w:sz w:val="18"/>
               </w:rPr>
-              <w:t>0 / 0.0% (n=64)</w:t>
+              <w:t>0 / 0.0% (n=68)</w:t>
             </w:r>
           </w:p>
         </w:tc>
@@ -10009,7 +11423,7 @@
                 <w:color w:val="000000"/>
                 <w:sz w:val="18"/>
               </w:rPr>
-              <w:t>0 / 0.0% (n=64)</w:t>
+              <w:t>0 / 0.0% (n=68)</w:t>
             </w:r>
           </w:p>
         </w:tc>
@@ -10116,7 +11530,7 @@
                 <w:color w:val="000000"/>
                 <w:sz w:val="18"/>
               </w:rPr>
-              <w:t>0 / 0.0% (n=64)</w:t>
+              <w:t>0 / 0.0% (n=68)</w:t>
             </w:r>
           </w:p>
         </w:tc>
@@ -10223,7 +11637,7 @@
                 <w:color w:val="000000"/>
                 <w:sz w:val="18"/>
               </w:rPr>
-              <w:t>0 / 0.0% (n=64)</w:t>
+              <w:t>0 / 0.0% (n=68)</w:t>
             </w:r>
           </w:p>
         </w:tc>
@@ -10330,7 +11744,7 @@
                 <w:color w:val="000000"/>
                 <w:sz w:val="18"/>
               </w:rPr>
-              <w:t>0 / 0.0% (n=64)</w:t>
+              <w:t>0 / 0.0% (n=68)</w:t>
             </w:r>
           </w:p>
         </w:tc>
@@ -10437,7 +11851,7 @@
                 <w:color w:val="000000"/>
                 <w:sz w:val="18"/>
               </w:rPr>
-              <w:t>0 / 0.0% (n=64)</w:t>
+              <w:t>0 / 0.0% (n=68)</w:t>
             </w:r>
           </w:p>
         </w:tc>
@@ -10544,7 +11958,7 @@
                 <w:color w:val="000000"/>
                 <w:sz w:val="18"/>
               </w:rPr>
-              <w:t>0 / 0.0% (n=64)</w:t>
+              <w:t>0 / 0.0% (n=68)</w:t>
             </w:r>
           </w:p>
         </w:tc>
@@ -10651,7 +12065,7 @@
                 <w:color w:val="000000"/>
                 <w:sz w:val="18"/>
               </w:rPr>
-              <w:t>0 / 0.0% (n=64)</w:t>
+              <w:t>0 / 0.0% (n=68)</w:t>
             </w:r>
           </w:p>
         </w:tc>
@@ -10758,7 +12172,7 @@
                 <w:color w:val="000000"/>
                 <w:sz w:val="18"/>
               </w:rPr>
-              <w:t>0 / 0.0% (n=64)</w:t>
+              <w:t>0 / 0.0% (n=68)</w:t>
             </w:r>
           </w:p>
         </w:tc>
@@ -10865,7 +12279,7 @@
                 <w:color w:val="000000"/>
                 <w:sz w:val="18"/>
               </w:rPr>
-              <w:t>0 / 0.0% (n=64)</w:t>
+              <w:t>0 / 0.0% (n=68)</w:t>
             </w:r>
           </w:p>
         </w:tc>
@@ -10972,7 +12386,7 @@
                 <w:color w:val="000000"/>
                 <w:sz w:val="18"/>
               </w:rPr>
-              <w:t>64 / 100.0% (n=64)</w:t>
+              <w:t>68 / 100.0% (n=68)</w:t>
             </w:r>
           </w:p>
         </w:tc>
@@ -11079,7 +12493,7 @@
                 <w:color w:val="000000"/>
                 <w:sz w:val="18"/>
               </w:rPr>
-              <w:t>0 / 0.0% (n=64)</w:t>
+              <w:t>0 / 0.0% (n=68)</w:t>
             </w:r>
           </w:p>
         </w:tc>
@@ -11186,7 +12600,7 @@
                 <w:color w:val="000000"/>
                 <w:sz w:val="18"/>
               </w:rPr>
-              <w:t>0 / 0.0% (n=64)</w:t>
+              <w:t>0 / 0.0% (n=68)</w:t>
             </w:r>
           </w:p>
         </w:tc>
@@ -11293,7 +12707,7 @@
                 <w:color w:val="000000"/>
                 <w:sz w:val="18"/>
               </w:rPr>
-              <w:t>0 / 0.0% (n=64)</w:t>
+              <w:t>0 / 0.0% (n=68)</w:t>
             </w:r>
           </w:p>
         </w:tc>
@@ -11400,7 +12814,7 @@
                 <w:color w:val="000000"/>
                 <w:sz w:val="18"/>
               </w:rPr>
-              <w:t>64 / 100.0% (n=64)</w:t>
+              <w:t>68 / 100.0% (n=68)</w:t>
             </w:r>
           </w:p>
         </w:tc>
@@ -11507,7 +12921,7 @@
                 <w:color w:val="000000"/>
                 <w:sz w:val="18"/>
               </w:rPr>
-              <w:t>0 / 0.0% (n=64)</w:t>
+              <w:t>0 / 0.0% (n=68)</w:t>
             </w:r>
           </w:p>
         </w:tc>
@@ -11614,7 +13028,7 @@
                 <w:color w:val="000000"/>
                 <w:sz w:val="18"/>
               </w:rPr>
-              <w:t>0 / 0.0% (n=64)</w:t>
+              <w:t>0 / 0.0% (n=68)</w:t>
             </w:r>
           </w:p>
         </w:tc>
@@ -11721,7 +13135,7 @@
                 <w:color w:val="000000"/>
                 <w:sz w:val="18"/>
               </w:rPr>
-              <w:t>0 / 0.0% (n=64)</w:t>
+              <w:t>0 / 0.0% (n=68)</w:t>
             </w:r>
           </w:p>
         </w:tc>
@@ -11828,7 +13242,7 @@
                 <w:color w:val="000000"/>
                 <w:sz w:val="18"/>
               </w:rPr>
-              <w:t>0 / 0.0% (n=64)</w:t>
+              <w:t>0 / 0.0% (n=68)</w:t>
             </w:r>
           </w:p>
         </w:tc>
@@ -11935,7 +13349,7 @@
                 <w:color w:val="000000"/>
                 <w:sz w:val="18"/>
               </w:rPr>
-              <w:t>0 / 0.0% (n=64)</w:t>
+              <w:t>0 / 0.0% (n=68)</w:t>
             </w:r>
           </w:p>
         </w:tc>
@@ -12042,7 +13456,7 @@
                 <w:color w:val="000000"/>
                 <w:sz w:val="18"/>
               </w:rPr>
-              <w:t>0 / 0.0% (n=64)</w:t>
+              <w:t>0 / 0.0% (n=68)</w:t>
             </w:r>
           </w:p>
         </w:tc>
@@ -12149,7 +13563,7 @@
                 <w:color w:val="000000"/>
                 <w:sz w:val="18"/>
               </w:rPr>
-              <w:t>0 / 0.0% (n=64)</w:t>
+              <w:t>0 / 0.0% (n=68)</w:t>
             </w:r>
           </w:p>
         </w:tc>
@@ -12256,7 +13670,7 @@
                 <w:color w:val="000000"/>
                 <w:sz w:val="18"/>
               </w:rPr>
-              <w:t>0 / 0.0% (n=64)</w:t>
+              <w:t>0 / 0.0% (n=68)</w:t>
             </w:r>
           </w:p>
         </w:tc>
@@ -12363,7 +13777,7 @@
                 <w:color w:val="000000"/>
                 <w:sz w:val="18"/>
               </w:rPr>
-              <w:t>0 / 0.0% (n=64)</w:t>
+              <w:t>0 / 0.0% (n=68)</w:t>
             </w:r>
           </w:p>
         </w:tc>
@@ -12470,7 +13884,7 @@
                 <w:color w:val="000000"/>
                 <w:sz w:val="18"/>
               </w:rPr>
-              <w:t>0 / 0.0% (n=64)</w:t>
+              <w:t>0 / 0.0% (n=68)</w:t>
             </w:r>
           </w:p>
         </w:tc>
@@ -12577,7 +13991,7 @@
                 <w:color w:val="000000"/>
                 <w:sz w:val="18"/>
               </w:rPr>
-              <w:t>0 / 0.0% (n=64)</w:t>
+              <w:t>0 / 0.0% (n=68)</w:t>
             </w:r>
           </w:p>
         </w:tc>
@@ -12684,7 +14098,7 @@
                 <w:color w:val="000000"/>
                 <w:sz w:val="18"/>
               </w:rPr>
-              <w:t>64 / 100.0% (n=64)</w:t>
+              <w:t>68 / 100.0% (n=68)</w:t>
             </w:r>
           </w:p>
         </w:tc>
@@ -12791,7 +14205,7 @@
                 <w:color w:val="000000"/>
                 <w:sz w:val="18"/>
               </w:rPr>
-              <w:t>64 / 100.0% (n=64)</w:t>
+              <w:t>68 / 100.0% (n=68)</w:t>
             </w:r>
           </w:p>
         </w:tc>
@@ -15155,6 +16569,18 @@
       <w:pPr>
         <w:spacing w:after="20"/>
       </w:pPr>
+    </w:p>
+    <w:p>
+      <w:pPr>
+        <w:widowControl/>
+      </w:pPr>
+      <w:r>
+        <w:rPr>
+          <w:rFonts w:ascii="Arial" w:hAnsi="Arial"/>
+          <w:color w:val="000000"/>
+        </w:rPr>
+        <w:t>The separate one-row aggregate CSV uses counts for attempted/successful/valid pairs and length-comparable pairs; seconds for request gaps and difference summaries; percentages for sMAPE and length comparability; UTC timestamps for cycle bounds; and a nominal cycle identifier. Its metric definitions are in the dated protocol and aggregate() function, outside the ORS observation dictionary.</w:t>
+      </w:r>
     </w:p>
     <w:p>
       <w:pPr>
@@ -15345,7 +16771,7 @@
                 <w:color w:val="000000"/>
                 <w:sz w:val="18"/>
               </w:rPr>
-              <w:t>64 / 64</w:t>
+              <w:t>68 / 68</w:t>
             </w:r>
           </w:p>
         </w:tc>
@@ -15432,7 +16858,7 @@
                 <w:color w:val="000000"/>
                 <w:sz w:val="18"/>
               </w:rPr>
-              <w:t>64 / 64</w:t>
+              <w:t>68 / 68</w:t>
             </w:r>
           </w:p>
         </w:tc>
@@ -15519,7 +16945,7 @@
                 <w:color w:val="000000"/>
                 <w:sz w:val="18"/>
               </w:rPr>
-              <w:t>64 / 64</w:t>
+              <w:t>68 / 68</w:t>
             </w:r>
           </w:p>
         </w:tc>
@@ -15606,7 +17032,7 @@
                 <w:color w:val="000000"/>
                 <w:sz w:val="18"/>
               </w:rPr>
-              <w:t>64 / 64</w:t>
+              <w:t>68 / 68</w:t>
             </w:r>
           </w:p>
         </w:tc>
@@ -15693,7 +17119,7 @@
                 <w:color w:val="000000"/>
                 <w:sz w:val="18"/>
               </w:rPr>
-              <w:t>64 / 64</w:t>
+              <w:t>68 / 68</w:t>
             </w:r>
           </w:p>
         </w:tc>
@@ -15780,7 +17206,7 @@
                 <w:color w:val="000000"/>
                 <w:sz w:val="18"/>
               </w:rPr>
-              <w:t>64 / 64</w:t>
+              <w:t>68 / 68</w:t>
             </w:r>
           </w:p>
         </w:tc>
@@ -15867,7 +17293,7 @@
                 <w:color w:val="000000"/>
                 <w:sz w:val="18"/>
               </w:rPr>
-              <w:t>64 / 64</w:t>
+              <w:t>68 / 68</w:t>
             </w:r>
           </w:p>
         </w:tc>
@@ -15954,7 +17380,7 @@
                 <w:color w:val="000000"/>
                 <w:sz w:val="18"/>
               </w:rPr>
-              <w:t>64 / 64</w:t>
+              <w:t>68 / 68</w:t>
             </w:r>
           </w:p>
         </w:tc>
@@ -16041,7 +17467,7 @@
                 <w:color w:val="000000"/>
                 <w:sz w:val="18"/>
               </w:rPr>
-              <w:t>64 / 64</w:t>
+              <w:t>68 / 68</w:t>
             </w:r>
           </w:p>
         </w:tc>
@@ -16128,7 +17554,7 @@
                 <w:color w:val="000000"/>
                 <w:sz w:val="18"/>
               </w:rPr>
-              <w:t>64 / 64</w:t>
+              <w:t>68 / 68</w:t>
             </w:r>
           </w:p>
         </w:tc>
@@ -16215,7 +17641,7 @@
                 <w:color w:val="000000"/>
                 <w:sz w:val="18"/>
               </w:rPr>
-              <w:t>64 / 64</w:t>
+              <w:t>68 / 68</w:t>
             </w:r>
           </w:p>
         </w:tc>
@@ -16302,7 +17728,7 @@
                 <w:color w:val="000000"/>
                 <w:sz w:val="18"/>
               </w:rPr>
-              <w:t>64 / 64</w:t>
+              <w:t>68 / 68</w:t>
             </w:r>
           </w:p>
         </w:tc>
@@ -16389,7 +17815,7 @@
                 <w:color w:val="000000"/>
                 <w:sz w:val="18"/>
               </w:rPr>
-              <w:t>64 / 64</w:t>
+              <w:t>68 / 68</w:t>
             </w:r>
           </w:p>
         </w:tc>
@@ -16476,7 +17902,7 @@
                 <w:color w:val="000000"/>
                 <w:sz w:val="18"/>
               </w:rPr>
-              <w:t>64 / 64</w:t>
+              <w:t>68 / 68</w:t>
             </w:r>
           </w:p>
         </w:tc>
@@ -16563,7 +17989,7 @@
                 <w:color w:val="000000"/>
                 <w:sz w:val="18"/>
               </w:rPr>
-              <w:t>64 / 64</w:t>
+              <w:t>68 / 68</w:t>
             </w:r>
           </w:p>
         </w:tc>
@@ -16736,7 +18162,7 @@
               <w:keepNext/>
               <w:spacing w:after="40" w:line="240" w:lineRule="auto"/>
             </w:pPr>
-            <w:hyperlink r:id="rId29">
+            <w:hyperlink r:id="rId34">
               <w:r>
                 <w:rPr>
                   <w:color w:val="174B76"/>
@@ -16802,7 +18228,7 @@
               <w:keepNext/>
               <w:spacing w:after="40" w:line="240" w:lineRule="auto"/>
             </w:pPr>
-            <w:hyperlink r:id="rId30">
+            <w:hyperlink r:id="rId35">
               <w:r>
                 <w:rPr>
                   <w:color w:val="174B76"/>
@@ -16868,7 +18294,7 @@
               <w:keepNext/>
               <w:spacing w:after="40" w:line="240" w:lineRule="auto"/>
             </w:pPr>
-            <w:hyperlink r:id="rId26">
+            <w:hyperlink r:id="rId30">
               <w:r>
                 <w:rPr>
                   <w:color w:val="174B76"/>
@@ -16934,7 +18360,7 @@
               <w:keepNext w:val="0"/>
               <w:spacing w:after="40" w:line="240" w:lineRule="auto"/>
             </w:pPr>
-            <w:hyperlink r:id="rId41">
+            <w:hyperlink r:id="rId47">
               <w:r>
                 <w:rPr>
                   <w:color w:val="174B76"/>
@@ -16989,7 +18415,7 @@
           <w:rFonts w:ascii="Arial" w:hAnsi="Arial"/>
           <w:color w:val="000000"/>
         </w:rPr>
-        <w:t>The recorded request interval is 2026-10-24T02:37:23.929322+00:00 to 2026-10-24T02:51:49.115212+00:00 in UTC. Usable observations cover 1 local date(s): 2026-10-24. Classification produces 0 peak, 0 off-peak and 64 other-period observations. These are coverage counts for the instrument, not evidence of congestion. The period table retains phase and provider so pilot activity cannot masquerade as scheduled coverage. Absent primary pairs prevent any comparison between peak and off-peak disagreement, regardless of how many ORS timestamps exist.</w:t>
+        <w:t>The recorded ORS interval is 2026-10-24T02:37:23.929322+00:00 to 2026-10-24T07:50:15.083095+00:00 in UTC. Usable observations cover 1 local date(s): 2026-10-24. Classification produces 0 peak, 0 off-peak and 68 other-period observations. These are instrument coverage counts, not evidence of congestion. Phase and provider remain explicit so pilot activity cannot masquerade as scheduled coverage. The separate Google–ORS exploratory cycle is also in the other period. Its pilot data and the amended window-level summary remain separate from this ORS table; actual follow-up coverage is reported in Segment 4.</w:t>
       </w:r>
     </w:p>
     <w:tbl>
@@ -17261,7 +18687,7 @@
                 <w:color w:val="000000"/>
                 <w:sz w:val="18"/>
               </w:rPr>
-              <w:t>scheduled (manual workflow_dispatch verification)</w:t>
+              <w:t>scheduled</w:t>
             </w:r>
           </w:p>
         </w:tc>
@@ -17341,7 +18767,7 @@
                 <w:color w:val="000000"/>
                 <w:sz w:val="18"/>
               </w:rPr>
-              <w:t>4</w:t>
+              <w:t>8</w:t>
             </w:r>
           </w:p>
         </w:tc>
@@ -17721,7 +19147,7 @@
                 <w:color w:val="000000"/>
                 <w:sz w:val="18"/>
               </w:rPr>
-              <w:t>0 verified cron; 4 manual workflow_dispatch test records (phase: scheduled)</w:t>
+              <w:t>4 verified cron; 4 manual workflow_dispatch test records (phase: scheduled)</w:t>
             </w:r>
           </w:p>
         </w:tc>
@@ -17746,7 +19172,7 @@
                 <w:color w:val="000000"/>
                 <w:sz w:val="18"/>
               </w:rPr>
-              <w:t>Primary traffic-provider pairs</w:t>
+              <w:t>Initial TomTom–2GIS pairs</w:t>
             </w:r>
           </w:p>
         </w:tc>
@@ -17766,7 +19192,7 @@
                 <w:color w:val="000000"/>
                 <w:sz w:val="18"/>
               </w:rPr>
-              <w:t>Prospective; collection disabled pending permissions</w:t>
+              <w:t>Unperformed; original permissions unresolved</w:t>
             </w:r>
           </w:p>
         </w:tc>
@@ -17802,6 +19228,71 @@
           </w:tcPr>
           <w:p>
             <w:pPr>
+              <w:keepNext/>
+              <w:spacing w:after="40" w:line="240" w:lineRule="auto"/>
+            </w:pPr>
+            <w:r>
+              <w:rPr>
+                <w:rFonts w:ascii="Arial" w:hAnsi="Arial"/>
+                <w:color w:val="000000"/>
+                <w:sz w:val="18"/>
+              </w:rPr>
+              <w:t>Initial TomTom–2GIS period coverage</w:t>
+            </w:r>
+          </w:p>
+        </w:tc>
+        <w:tc>
+          <w:tcPr>
+            <w:tcW w:type="dxa" w:w="3175"/>
+            <w:vAlign w:val="center"/>
+          </w:tcPr>
+          <w:p>
+            <w:pPr>
+              <w:keepNext/>
+              <w:spacing w:after="40" w:line="240" w:lineRule="auto"/>
+            </w:pPr>
+            <w:r>
+              <w:rPr>
+                <w:rFonts w:ascii="Arial" w:hAnsi="Arial"/>
+                <w:color w:val="000000"/>
+                <w:sz w:val="18"/>
+              </w:rPr>
+              <w:t>Both required for the original H1</w:t>
+            </w:r>
+          </w:p>
+        </w:tc>
+        <w:tc>
+          <w:tcPr>
+            <w:tcW w:type="dxa" w:w="3175"/>
+            <w:vAlign w:val="center"/>
+          </w:tcPr>
+          <w:p>
+            <w:pPr>
+              <w:keepNext/>
+              <w:spacing w:after="40" w:line="240" w:lineRule="auto"/>
+            </w:pPr>
+            <w:r>
+              <w:rPr>
+                <w:rFonts w:ascii="Arial" w:hAnsi="Arial"/>
+                <w:color w:val="000000"/>
+                <w:sz w:val="18"/>
+              </w:rPr>
+              <w:t>Peak 0; off-peak 0; other 0</w:t>
+            </w:r>
+          </w:p>
+        </w:tc>
+      </w:tr>
+      <w:tr>
+        <w:trPr>
+          <w:cantSplit/>
+        </w:trPr>
+        <w:tc>
+          <w:tcPr>
+            <w:tcW w:type="dxa" w:w="3288"/>
+            <w:vAlign w:val="center"/>
+          </w:tcPr>
+          <w:p>
+            <w:pPr>
               <w:keepNext w:val="0"/>
               <w:spacing w:after="40" w:line="240" w:lineRule="auto"/>
             </w:pPr>
@@ -17811,7 +19302,7 @@
                 <w:color w:val="000000"/>
                 <w:sz w:val="18"/>
               </w:rPr>
-              <w:t>Primary peak and off-peak coverage</w:t>
+              <w:t>Amended Google–ORS follow-up</w:t>
             </w:r>
           </w:p>
         </w:tc>
@@ -17831,7 +19322,7 @@
                 <w:color w:val="000000"/>
                 <w:sz w:val="18"/>
               </w:rPr>
-              <w:t>Both required for H1</w:t>
+              <w:t>5 windows; at most 100 pairs</w:t>
             </w:r>
           </w:p>
         </w:tc>
@@ -17851,7 +19342,7 @@
                 <w:color w:val="000000"/>
                 <w:sz w:val="18"/>
               </w:rPr>
-              <w:t>Peak 0; off-peak 0; other 0</w:t>
+              <w:t>0 recorded windows; 0 valid windows; 0 pairs in valid windows</w:t>
             </w:r>
           </w:p>
         </w:tc>
@@ -17861,6 +19352,411 @@
       <w:pPr>
         <w:spacing w:after="20"/>
       </w:pPr>
+    </w:p>
+    <w:tbl>
+      <w:tblPr>
+        <w:tblW w:type="auto" w:w="0"/>
+        <w:jc w:val="center"/>
+        <w:tblLayout w:type="fixed"/>
+        <w:tblLook w:firstColumn="1" w:firstRow="1" w:lastColumn="0" w:lastRow="0" w:noHBand="0" w:noVBand="1" w:val="04A0"/>
+        <w:tblBorders>
+          <w:top w:val="single" w:sz="4" w:color="B8B8B8"/>
+          <w:left w:val="single" w:sz="4" w:color="B8B8B8"/>
+          <w:bottom w:val="single" w:sz="4" w:color="B8B8B8"/>
+          <w:right w:val="single" w:sz="4" w:color="B8B8B8"/>
+          <w:insideH w:val="single" w:sz="4" w:color="B8B8B8"/>
+          <w:insideV w:val="single" w:sz="4" w:color="B8B8B8"/>
+        </w:tblBorders>
+        <w:tblCellMar>
+          <w:top w:w="80" w:type="dxa"/>
+          <w:bottom w:w="80" w:type="dxa"/>
+          <w:left w:w="80" w:type="dxa"/>
+          <w:right w:w="80" w:type="dxa"/>
+        </w:tblCellMar>
+      </w:tblPr>
+      <w:tblGrid>
+        <w:gridCol w:w="1417"/>
+        <w:gridCol w:w="2154"/>
+        <w:gridCol w:w="1531"/>
+        <w:gridCol w:w="1928"/>
+        <w:gridCol w:w="2608"/>
+      </w:tblGrid>
+      <w:tr>
+        <w:trPr>
+          <w:tblHeader/>
+          <w:cantSplit/>
+        </w:trPr>
+        <w:tc>
+          <w:tcPr>
+            <w:tcW w:type="dxa" w:w="1417"/>
+            <w:vAlign w:val="center"/>
+            <w:shd w:fill="EAEAEA"/>
+          </w:tcPr>
+          <w:p>
+            <w:pPr>
+              <w:keepNext/>
+              <w:spacing w:after="40" w:line="240" w:lineRule="auto"/>
+            </w:pPr>
+            <w:r>
+              <w:rPr>
+                <w:rFonts w:ascii="Arial" w:hAnsi="Arial"/>
+                <w:b/>
+                <w:color w:val="000000"/>
+                <w:sz w:val="18"/>
+              </w:rPr>
+              <w:t>Amended period</w:t>
+            </w:r>
+          </w:p>
+        </w:tc>
+        <w:tc>
+          <w:tcPr>
+            <w:tcW w:type="dxa" w:w="2154"/>
+            <w:vAlign w:val="center"/>
+            <w:shd w:fill="EAEAEA"/>
+          </w:tcPr>
+          <w:p>
+            <w:pPr>
+              <w:keepNext/>
+              <w:spacing w:after="40" w:line="240" w:lineRule="auto"/>
+            </w:pPr>
+            <w:r>
+              <w:rPr>
+                <w:rFonts w:ascii="Arial" w:hAnsi="Arial"/>
+                <w:b/>
+                <w:color w:val="000000"/>
+                <w:sz w:val="18"/>
+              </w:rPr>
+              <w:t>Planned / recorded windows</w:t>
+            </w:r>
+          </w:p>
+        </w:tc>
+        <w:tc>
+          <w:tcPr>
+            <w:tcW w:type="dxa" w:w="1531"/>
+            <w:vAlign w:val="center"/>
+            <w:shd w:fill="EAEAEA"/>
+          </w:tcPr>
+          <w:p>
+            <w:pPr>
+              <w:keepNext/>
+              <w:spacing w:after="40" w:line="240" w:lineRule="auto"/>
+            </w:pPr>
+            <w:r>
+              <w:rPr>
+                <w:rFonts w:ascii="Arial" w:hAnsi="Arial"/>
+                <w:b/>
+                <w:color w:val="000000"/>
+                <w:sz w:val="18"/>
+              </w:rPr>
+              <w:t>Valid windows</w:t>
+            </w:r>
+          </w:p>
+        </w:tc>
+        <w:tc>
+          <w:tcPr>
+            <w:tcW w:type="dxa" w:w="1928"/>
+            <w:vAlign w:val="center"/>
+            <w:shd w:fill="EAEAEA"/>
+          </w:tcPr>
+          <w:p>
+            <w:pPr>
+              <w:keepNext/>
+              <w:spacing w:after="40" w:line="240" w:lineRule="auto"/>
+            </w:pPr>
+            <w:r>
+              <w:rPr>
+                <w:rFonts w:ascii="Arial" w:hAnsi="Arial"/>
+                <w:b/>
+                <w:color w:val="000000"/>
+                <w:sz w:val="18"/>
+              </w:rPr>
+              <w:t>Pairs in valid windows</w:t>
+            </w:r>
+          </w:p>
+        </w:tc>
+        <w:tc>
+          <w:tcPr>
+            <w:tcW w:type="dxa" w:w="2608"/>
+            <w:vAlign w:val="center"/>
+            <w:shd w:fill="EAEAEA"/>
+          </w:tcPr>
+          <w:p>
+            <w:pPr>
+              <w:keepNext/>
+              <w:spacing w:after="40" w:line="240" w:lineRule="auto"/>
+            </w:pPr>
+            <w:r>
+              <w:rPr>
+                <w:rFonts w:ascii="Arial" w:hAnsi="Arial"/>
+                <w:b/>
+                <w:color w:val="000000"/>
+                <w:sz w:val="18"/>
+              </w:rPr>
+              <w:t>Median of window median |d| (s)</w:t>
+            </w:r>
+          </w:p>
+        </w:tc>
+      </w:tr>
+      <w:tr>
+        <w:trPr>
+          <w:cantSplit/>
+        </w:trPr>
+        <w:tc>
+          <w:tcPr>
+            <w:tcW w:type="dxa" w:w="1417"/>
+            <w:vAlign w:val="center"/>
+          </w:tcPr>
+          <w:p>
+            <w:pPr>
+              <w:keepNext/>
+              <w:spacing w:after="40" w:line="240" w:lineRule="auto"/>
+            </w:pPr>
+            <w:r>
+              <w:rPr>
+                <w:rFonts w:ascii="Arial" w:hAnsi="Arial"/>
+                <w:color w:val="000000"/>
+                <w:sz w:val="18"/>
+              </w:rPr>
+              <w:t>peak</w:t>
+            </w:r>
+          </w:p>
+        </w:tc>
+        <w:tc>
+          <w:tcPr>
+            <w:tcW w:type="dxa" w:w="2154"/>
+            <w:vAlign w:val="center"/>
+          </w:tcPr>
+          <w:p>
+            <w:pPr>
+              <w:keepNext/>
+              <w:spacing w:after="40" w:line="240" w:lineRule="auto"/>
+            </w:pPr>
+            <w:r>
+              <w:rPr>
+                <w:rFonts w:ascii="Arial" w:hAnsi="Arial"/>
+                <w:color w:val="000000"/>
+                <w:sz w:val="18"/>
+              </w:rPr>
+              <w:t>2 / 0</w:t>
+            </w:r>
+          </w:p>
+        </w:tc>
+        <w:tc>
+          <w:tcPr>
+            <w:tcW w:type="dxa" w:w="1531"/>
+            <w:vAlign w:val="center"/>
+          </w:tcPr>
+          <w:p>
+            <w:pPr>
+              <w:keepNext/>
+              <w:spacing w:after="40" w:line="240" w:lineRule="auto"/>
+            </w:pPr>
+            <w:r>
+              <w:rPr>
+                <w:rFonts w:ascii="Arial" w:hAnsi="Arial"/>
+                <w:color w:val="000000"/>
+                <w:sz w:val="18"/>
+              </w:rPr>
+              <w:t>0</w:t>
+            </w:r>
+          </w:p>
+        </w:tc>
+        <w:tc>
+          <w:tcPr>
+            <w:tcW w:type="dxa" w:w="1928"/>
+            <w:vAlign w:val="center"/>
+          </w:tcPr>
+          <w:p>
+            <w:pPr>
+              <w:keepNext/>
+              <w:spacing w:after="40" w:line="240" w:lineRule="auto"/>
+            </w:pPr>
+            <w:r>
+              <w:rPr>
+                <w:rFonts w:ascii="Arial" w:hAnsi="Arial"/>
+                <w:color w:val="000000"/>
+                <w:sz w:val="18"/>
+              </w:rPr>
+              <w:t>0</w:t>
+            </w:r>
+          </w:p>
+        </w:tc>
+        <w:tc>
+          <w:tcPr>
+            <w:tcW w:type="dxa" w:w="2608"/>
+            <w:vAlign w:val="center"/>
+          </w:tcPr>
+          <w:p>
+            <w:pPr>
+              <w:keepNext/>
+              <w:spacing w:after="40" w:line="240" w:lineRule="auto"/>
+            </w:pPr>
+            <w:r>
+              <w:rPr>
+                <w:rFonts w:ascii="Arial" w:hAnsi="Arial"/>
+                <w:color w:val="000000"/>
+                <w:sz w:val="18"/>
+              </w:rPr>
+              <w:t>Not estimable</w:t>
+            </w:r>
+          </w:p>
+        </w:tc>
+      </w:tr>
+      <w:tr>
+        <w:trPr>
+          <w:cantSplit/>
+        </w:trPr>
+        <w:tc>
+          <w:tcPr>
+            <w:tcW w:type="dxa" w:w="1417"/>
+            <w:vAlign w:val="center"/>
+          </w:tcPr>
+          <w:p>
+            <w:pPr>
+              <w:keepNext w:val="0"/>
+              <w:spacing w:after="40" w:line="240" w:lineRule="auto"/>
+            </w:pPr>
+            <w:r>
+              <w:rPr>
+                <w:rFonts w:ascii="Arial" w:hAnsi="Arial"/>
+                <w:color w:val="000000"/>
+                <w:sz w:val="18"/>
+              </w:rPr>
+              <w:t>offpeak</w:t>
+            </w:r>
+          </w:p>
+        </w:tc>
+        <w:tc>
+          <w:tcPr>
+            <w:tcW w:type="dxa" w:w="2154"/>
+            <w:vAlign w:val="center"/>
+          </w:tcPr>
+          <w:p>
+            <w:pPr>
+              <w:keepNext w:val="0"/>
+              <w:spacing w:after="40" w:line="240" w:lineRule="auto"/>
+            </w:pPr>
+            <w:r>
+              <w:rPr>
+                <w:rFonts w:ascii="Arial" w:hAnsi="Arial"/>
+                <w:color w:val="000000"/>
+                <w:sz w:val="18"/>
+              </w:rPr>
+              <w:t>3 / 0</w:t>
+            </w:r>
+          </w:p>
+        </w:tc>
+        <w:tc>
+          <w:tcPr>
+            <w:tcW w:type="dxa" w:w="1531"/>
+            <w:vAlign w:val="center"/>
+          </w:tcPr>
+          <w:p>
+            <w:pPr>
+              <w:keepNext w:val="0"/>
+              <w:spacing w:after="40" w:line="240" w:lineRule="auto"/>
+            </w:pPr>
+            <w:r>
+              <w:rPr>
+                <w:rFonts w:ascii="Arial" w:hAnsi="Arial"/>
+                <w:color w:val="000000"/>
+                <w:sz w:val="18"/>
+              </w:rPr>
+              <w:t>0</w:t>
+            </w:r>
+          </w:p>
+        </w:tc>
+        <w:tc>
+          <w:tcPr>
+            <w:tcW w:type="dxa" w:w="1928"/>
+            <w:vAlign w:val="center"/>
+          </w:tcPr>
+          <w:p>
+            <w:pPr>
+              <w:keepNext w:val="0"/>
+              <w:spacing w:after="40" w:line="240" w:lineRule="auto"/>
+            </w:pPr>
+            <w:r>
+              <w:rPr>
+                <w:rFonts w:ascii="Arial" w:hAnsi="Arial"/>
+                <w:color w:val="000000"/>
+                <w:sz w:val="18"/>
+              </w:rPr>
+              <w:t>0</w:t>
+            </w:r>
+          </w:p>
+        </w:tc>
+        <w:tc>
+          <w:tcPr>
+            <w:tcW w:type="dxa" w:w="2608"/>
+            <w:vAlign w:val="center"/>
+          </w:tcPr>
+          <w:p>
+            <w:pPr>
+              <w:keepNext w:val="0"/>
+              <w:spacing w:after="40" w:line="240" w:lineRule="auto"/>
+            </w:pPr>
+            <w:r>
+              <w:rPr>
+                <w:rFonts w:ascii="Arial" w:hAnsi="Arial"/>
+                <w:color w:val="000000"/>
+                <w:sz w:val="18"/>
+              </w:rPr>
+              <w:t>Not estimable</w:t>
+            </w:r>
+          </w:p>
+        </w:tc>
+      </w:tr>
+    </w:tbl>
+    <w:p>
+      <w:pPr>
+        <w:spacing w:after="20"/>
+      </w:pPr>
+    </w:p>
+    <w:p>
+      <w:pPr>
+        <w:widowControl/>
+      </w:pPr>
+      <w:r>
+        <w:rPr>
+          <w:rFonts w:ascii="Arial" w:hAnsi="Arial"/>
+          <w:color w:val="000000"/>
+        </w:rPr>
+        <w:t xml:space="preserve">Follow-up summary timestamp: 2026-10-24T11:36:46.249129+00:00. Window summaries require at least five valid pairs. The period statistic is a median of window medians, not a pooled route-level median. Source: </w:t>
+      </w:r>
+      <w:hyperlink r:id="rId48">
+        <w:r>
+          <w:rPr>
+            <w:color w:val="174B76"/>
+            <w:sz w:val="18"/>
+          </w:rPr>
+          <w:t>https://github.com/SuperFlyTK/rmt-a3-travel-time-astana/blob/main/results/google_followup_period_summary.csv</w:t>
+        </w:r>
+      </w:hyperlink>
+    </w:p>
+    <w:p>
+      <w:pPr>
+        <w:widowControl/>
+      </w:pPr>
+      <w:r>
+        <w:rPr>
+          <w:rFonts w:ascii="Arial" w:hAnsi="Arial"/>
+          <w:color w:val="000000"/>
+        </w:rPr>
+        <w:t>Peak/off-peak difference and ratio are not estimable until both periods have valid windows. No missing period is represented by zero.</w:t>
+      </w:r>
+    </w:p>
+    <w:p>
+      <w:pPr>
+        <w:widowControl/>
+      </w:pPr>
+      <w:r>
+        <w:rPr>
+          <w:rFonts w:ascii="Arial" w:hAnsi="Arial"/>
+          <w:color w:val="000000"/>
+        </w:rPr>
+        <w:t>Separate exploratory protocol: at most 20 Google–ORS pairs planned; 20 attempted and 20 valid. These are excluded from the completion counts and ER verdicts above.</w:t>
+      </w:r>
     </w:p>
     <w:p>
       <w:pPr>
@@ -18031,7 +19927,7 @@
                 <w:color w:val="000000"/>
                 <w:sz w:val="18"/>
               </w:rPr>
-              <w:t>0 primary pairs; no permitted traffic-aware comparison.</w:t>
+              <w:t>0 initial TomTom–2GIS pairs. The amended Google–ORS control design does not directly test this original expected result.</w:t>
             </w:r>
           </w:p>
         </w:tc>
@@ -18116,7 +20012,7 @@
                 <w:color w:val="000000"/>
                 <w:sz w:val="18"/>
               </w:rPr>
-              <w:t>0 primary pairs; no permitted traffic-aware comparison.</w:t>
+              <w:t>0 initial TomTom–2GIS pairs. The amended Google–ORS control design does not directly test this original expected result.</w:t>
             </w:r>
           </w:p>
         </w:tc>
@@ -18201,7 +20097,7 @@
                 <w:color w:val="000000"/>
                 <w:sz w:val="18"/>
               </w:rPr>
-              <w:t>0 primary pairs; no permitted traffic-aware comparison.</w:t>
+              <w:t>0 initial TomTom–2GIS pairs. The amended Google–ORS control design does not directly test this original expected result.</w:t>
             </w:r>
           </w:p>
         </w:tc>
@@ -18286,7 +20182,7 @@
                 <w:color w:val="000000"/>
                 <w:sz w:val="18"/>
               </w:rPr>
-              <w:t>0 primary pairs; no permitted traffic-aware comparison.</w:t>
+              <w:t>0 initial TomTom–2GIS pairs. The amended Google–ORS control design does not directly test this original expected result.</w:t>
             </w:r>
           </w:p>
         </w:tc>
@@ -18371,7 +20267,7 @@
                 <w:color w:val="000000"/>
                 <w:sz w:val="18"/>
               </w:rPr>
-              <w:t>0/64 unique ORS requests failed the valid-route screen (0%).</w:t>
+              <w:t>0/68 unique ORS requests failed the valid-route screen (0%).</w:t>
             </w:r>
           </w:p>
         </w:tc>
@@ -18456,7 +20352,7 @@
                 <w:color w:val="000000"/>
                 <w:sz w:val="18"/>
               </w:rPr>
-              <w:t>64/64 unique ORS requests finished within 10 seconds (100%).</w:t>
+              <w:t>68/68 unique ORS requests finished within 10 seconds (100%).</w:t>
             </w:r>
           </w:p>
         </w:tc>
@@ -18626,7 +20522,7 @@
                 <w:color w:val="000000"/>
                 <w:sz w:val="18"/>
               </w:rPr>
-              <w:t>0 verified cron-triggered attempts; 4 manual workflow_dispatch verification records (collector phase scheduled); collection window still open.</w:t>
+              <w:t>4 verified cron-triggered attempts; 4 manual workflow_dispatch verification records (collector phase scheduled); collection window still open.</w:t>
             </w:r>
           </w:p>
         </w:tc>
@@ -18694,7 +20590,7 @@
           <w:rFonts w:ascii="Arial" w:hAnsi="Arial"/>
           <w:color w:val="000000"/>
         </w:rPr>
-        <w:t>The first records test whether the instrument can produce traceable, usable data. They cannot answer the traffic-provider question. The no-traffic field is unavailable as a separate ORS measurement, and all primary disagreement measures lack an eligible provider pair. These are substantive limits of the available instrument, not evidence that traffic effects or provider differences are absent. Pilot success is assessed against the predeclared reliability expectations; it is not a conclusion that one route service is more accurate or that an observed estimate matches a real trip.</w:t>
+        <w:t>The ORS records test extraction, completeness, timing and provenance against ER5–ER8. The separate Google–ORS pilot demonstrates measurable output disagreement, but all its pairs fall outside the defined peak and off-peak windows. The amended period contrast is not yet estimable because both periods do not have valid window summaries. ER1–ER4 remain untested expectations for the initial TomTom–2GIS design. The absence of that comparison is not evidence of equal services, absent congestion or accurate journey prediction.</w:t>
       </w:r>
     </w:p>
     <w:p>
@@ -18706,7 +20602,19 @@
           <w:rFonts w:ascii="Arial" w:hAnsi="Arial"/>
           <w:color w:val="000000"/>
         </w:rPr>
-        <w:t>Access and terms behaved differently from the initial assumption that a working key would be sufficient for research publication. The amendment on 24 October 2026 consequently restricted active collection to ORS and reduced the scheduled workload to rotating batches. The primary hypotheses, fixed endpoints, time classification and falsification thresholds remain unchanged. Any later traffic-provider collection requires documented permission and a dated activation decision. Earlier ORS observations will retain their control status. This preserves comparability of the instrument record while acknowledging that a permitted, paired traffic sample is still required before the main study can be interpreted.</w:t>
+        <w:t>Access and publication terms changed the feasible design. The main collector remains an ORS instrument, while the later approved protocol adds five bounded Google–ORS windows under aggregate-only retention. This is an explicit change of comparator and analysis, not a retrospective rewriting of the original expectations. The route set and period definitions remain fixed. Future interpretation will compare per-window summaries descriptively, retain actual dates and sample counts, and report missed windows instead of filling them.</w:t>
+      </w:r>
+    </w:p>
+    <w:p>
+      <w:pPr>
+        <w:widowControl/>
+      </w:pPr>
+      <w:r>
+        <w:rPr>
+          <w:rFonts w:ascii="Arial" w:hAnsi="Arial"/>
+          <w:color w:val="000000"/>
+        </w:rPr>
+        <w:t>The dated Google pilot protocol produced 20 valid exploratory pairs. Its median Google-minus-ORS difference was 730.5 seconds. This is disagreement under the chosen request settings, not measured error. Different paths, speed models and traffic inputs can all contribute; ORS is not a Google traffic-off counterfactual. One cycle cannot test a peak-versus-off-peak hypothesis. Retaining only aggregate Google results also prevents independent numerical reconstruction from saved responses. The bounded test is not a test of either the initial or amended period hypothesis.</w:t>
       </w:r>
     </w:p>
     <w:p>
@@ -18740,7 +20648,7 @@
         </w:rPr>
         <w:t xml:space="preserve">2GIS (2026) Routing API overview. Available at: </w:t>
       </w:r>
-      <w:hyperlink r:id="rId39">
+      <w:hyperlink r:id="rId44">
         <w:r>
           <w:rPr>
             <w:color w:val="174B76"/>
@@ -18768,7 +20676,7 @@
         </w:rPr>
         <w:t xml:space="preserve">2GIS (2026) WebAPI licence offer. Available at: </w:t>
       </w:r>
-      <w:hyperlink r:id="rId42">
+      <w:hyperlink r:id="rId49">
         <w:r>
           <w:rPr>
             <w:color w:val="174B76"/>
@@ -18796,7 +20704,7 @@
         </w:rPr>
         <w:t xml:space="preserve">Bastarianto, F.F., Hancock, T.O., Ilahi, A., Manley, E. and Choudhury, C.F. (2025) '‘Mind the Gap’—The impact of discrepancies between Google Maps API and reported travel data in the Global South', Case Studies on Transport Policy, 21, 101508. </w:t>
       </w:r>
-      <w:hyperlink r:id="rId43">
+      <w:hyperlink r:id="rId50">
         <w:r>
           <w:rPr>
             <w:color w:val="174B76"/>
@@ -18817,7 +20725,7 @@
         </w:rPr>
         <w:t xml:space="preserve">Boeing, G. and Zhou, Y. (2026) 'Travel time prediction from sparse open data', International Journal of Geographical Information Science, 40(10), pp. 3412–3428. </w:t>
       </w:r>
-      <w:hyperlink r:id="rId44">
+      <w:hyperlink r:id="rId51">
         <w:r>
           <w:rPr>
             <w:color w:val="174B76"/>
@@ -18838,7 +20746,7 @@
         </w:rPr>
         <w:t xml:space="preserve">Derrow-Pinion, A., She, J., Wong, D., Lange, O., Hester, T., Perez, L., Nunkesser, M., Lee, S., Guo, X., Wiltshire, B., Battaglia, P.W., Gupta, V., Li, A., Xu, Z., Sanchez-Gonzalez, A., Li, Y. and Veličković, P. (2021) 'ETA Prediction with Graph Neural Networks in Google Maps', Proceedings of the 30th ACM International Conference on Information &amp; Knowledge Management, pp. 3767–3776. </w:t>
       </w:r>
-      <w:hyperlink r:id="rId45">
+      <w:hyperlink r:id="rId52">
         <w:r>
           <w:rPr>
             <w:color w:val="174B76"/>
@@ -18859,7 +20767,7 @@
         </w:rPr>
         <w:t xml:space="preserve">Elnaggar, G.R., Al-Hourani, S. and Abutaha, R. (2025) 'Real-Time Urban Congestion Monitoring in Jeddah, Saudi Arabia, Using the Google Maps API: A Data-Driven Framework for Middle Eastern Cities', Sustainability, 17(18), 8194. </w:t>
       </w:r>
-      <w:hyperlink r:id="rId46">
+      <w:hyperlink r:id="rId53">
         <w:r>
           <w:rPr>
             <w:color w:val="174B76"/>
@@ -18880,7 +20788,7 @@
         </w:rPr>
         <w:t xml:space="preserve">Fu, X., Kakkar, D., Chen, J., Moynihan, K.M., Hegland, T.A. and Blossom, J. (2023) 'A comparative study of methods for drive time estimation on geospatial big data: A case study in USA', The International Archives of the Photogrammetry, Remote Sensing and Spatial Information Sciences, XLVIII-4/W7-2023, pp. 53–60. </w:t>
       </w:r>
-      <w:hyperlink r:id="rId47">
+      <w:hyperlink r:id="rId54">
         <w:r>
           <w:rPr>
             <w:color w:val="174B76"/>
@@ -18899,9 +20807,93 @@
           <w:rFonts w:ascii="Arial" w:hAnsi="Arial"/>
           <w:color w:val="000000"/>
         </w:rPr>
+        <w:t xml:space="preserve">Google (2026) Google Maps Platform terms. Available at: </w:t>
+      </w:r>
+      <w:hyperlink r:id="rId46">
+        <w:r>
+          <w:rPr>
+            <w:color w:val="174B76"/>
+            <w:sz w:val="18"/>
+          </w:rPr>
+          <w:t>https://cloud.google.com/maps-platform/terms</w:t>
+        </w:r>
+      </w:hyperlink>
+      <w:r>
+        <w:rPr>
+          <w:rFonts w:ascii="Arial" w:hAnsi="Arial"/>
+          <w:color w:val="000000"/>
+        </w:rPr>
+        <w:t xml:space="preserve"> (Accessed: 24 October 2026).</w:t>
+      </w:r>
+    </w:p>
+    <w:p>
+      <w:pPr>
+        <w:widowControl/>
+      </w:pPr>
+      <w:r>
+        <w:rPr>
+          <w:rFonts w:ascii="Arial" w:hAnsi="Arial"/>
+          <w:color w:val="000000"/>
+        </w:rPr>
+        <w:t xml:space="preserve">Google (2026) Maps Demo Key. Available at: </w:t>
+      </w:r>
+      <w:hyperlink r:id="rId55">
+        <w:r>
+          <w:rPr>
+            <w:color w:val="174B76"/>
+            <w:sz w:val="18"/>
+          </w:rPr>
+          <w:t>https://developers.google.com/maps/demo-key</w:t>
+        </w:r>
+      </w:hyperlink>
+      <w:r>
+        <w:rPr>
+          <w:rFonts w:ascii="Arial" w:hAnsi="Arial"/>
+          <w:color w:val="000000"/>
+        </w:rPr>
+        <w:t xml:space="preserve"> (Accessed: 24 October 2026).</w:t>
+      </w:r>
+    </w:p>
+    <w:p>
+      <w:pPr>
+        <w:widowControl/>
+      </w:pPr>
+      <w:r>
+        <w:rPr>
+          <w:rFonts w:ascii="Arial" w:hAnsi="Arial"/>
+          <w:color w:val="000000"/>
+        </w:rPr>
+        <w:t xml:space="preserve">Google (2026) Maps Platform Demo Project terms. Available at: </w:t>
+      </w:r>
+      <w:hyperlink r:id="rId56">
+        <w:r>
+          <w:rPr>
+            <w:color w:val="174B76"/>
+            <w:sz w:val="18"/>
+          </w:rPr>
+          <w:t>https://cloud.google.com/terms/maps-platform/demo-project-terms</w:t>
+        </w:r>
+      </w:hyperlink>
+      <w:r>
+        <w:rPr>
+          <w:rFonts w:ascii="Arial" w:hAnsi="Arial"/>
+          <w:color w:val="000000"/>
+        </w:rPr>
+        <w:t xml:space="preserve"> (Accessed: 24 October 2026).</w:t>
+      </w:r>
+    </w:p>
+    <w:p>
+      <w:pPr>
+        <w:widowControl/>
+      </w:pPr>
+      <w:r>
+        <w:rPr>
+          <w:rFonts w:ascii="Arial" w:hAnsi="Arial"/>
+          <w:color w:val="000000"/>
+        </w:rPr>
         <w:t xml:space="preserve">HeiGIT (2026) Isochrone traffic data: maintainer response. Available at: </w:t>
       </w:r>
-      <w:hyperlink r:id="rId48">
+      <w:hyperlink r:id="rId57">
         <w:r>
           <w:rPr>
             <w:color w:val="174B76"/>
@@ -18929,7 +20921,7 @@
         </w:rPr>
         <w:t xml:space="preserve">HeiGIT (2026) openrouteservice API reference. Available at: </w:t>
       </w:r>
-      <w:hyperlink r:id="rId49">
+      <w:hyperlink r:id="rId58">
         <w:r>
           <w:rPr>
             <w:color w:val="174B76"/>
@@ -18957,7 +20949,7 @@
         </w:rPr>
         <w:t xml:space="preserve">HeiGIT (2026) openrouteservice frequently asked questions. Available at: </w:t>
       </w:r>
-      <w:hyperlink r:id="rId50">
+      <w:hyperlink r:id="rId59">
         <w:r>
           <w:rPr>
             <w:color w:val="174B76"/>
@@ -18985,7 +20977,7 @@
         </w:rPr>
         <w:t xml:space="preserve">HeiGIT (2026) Terms of service. Available at: </w:t>
       </w:r>
-      <w:hyperlink r:id="rId36">
+      <w:hyperlink r:id="rId41">
         <w:r>
           <w:rPr>
             <w:color w:val="174B76"/>
@@ -19013,7 +21005,7 @@
         </w:rPr>
         <w:t xml:space="preserve">Hodson, T.O. (2022) 'Root-mean-square error (RMSE) or mean absolute error (MAE): when to use them or not', Geoscientific Model Development, 15(14), pp. 5481–5487. </w:t>
       </w:r>
-      <w:hyperlink r:id="rId51">
+      <w:hyperlink r:id="rId60">
         <w:r>
           <w:rPr>
             <w:color w:val="174B76"/>
@@ -19034,7 +21026,7 @@
         </w:rPr>
         <w:t xml:space="preserve">Mansurova, A., Mussina, A., Aubakirov, S., Nugumanova, A. and Yedilkhan, D. (2025) 'From Raw GPS to GTFS: A Real-World Open Dataset for Bus Travel Time Prediction', Data, 10(8), 119. </w:t>
       </w:r>
-      <w:hyperlink r:id="rId52">
+      <w:hyperlink r:id="rId61">
         <w:r>
           <w:rPr>
             <w:color w:val="174B76"/>
@@ -19055,7 +21047,7 @@
         </w:rPr>
         <w:t xml:space="preserve">OpenStreetMap contributors (2026) Copyright and licence. Available at: </w:t>
       </w:r>
-      <w:hyperlink r:id="rId37">
+      <w:hyperlink r:id="rId42">
         <w:r>
           <w:rPr>
             <w:color w:val="174B76"/>
@@ -19083,7 +21075,7 @@
         </w:rPr>
         <w:t xml:space="preserve">Soon, K.L., Chan, R.K.C., Lim, J.M.-Y. and Parthiban, R. (2023) 'Short-term traffic forecasting model: prevailing trends and guidelines', Transportation Safety and Environment, 5(3), tdac058. </w:t>
       </w:r>
-      <w:hyperlink r:id="rId53">
+      <w:hyperlink r:id="rId62">
         <w:r>
           <w:rPr>
             <w:color w:val="174B76"/>
@@ -19104,7 +21096,7 @@
         </w:rPr>
         <w:t xml:space="preserve">TomTom (2026) Calculate Route documentation. Available at: </w:t>
       </w:r>
-      <w:hyperlink r:id="rId54">
+      <w:hyperlink r:id="rId63">
         <w:r>
           <w:rPr>
             <w:color w:val="174B76"/>
@@ -19132,7 +21124,7 @@
         </w:rPr>
         <w:t xml:space="preserve">TomTom (2026) Portal terms and conditions. Available at: </w:t>
       </w:r>
-      <w:hyperlink r:id="rId38">
+      <w:hyperlink r:id="rId43">
         <w:r>
           <w:rPr>
             <w:color w:val="174B76"/>
@@ -19160,7 +21152,7 @@
         </w:rPr>
         <w:t xml:space="preserve">TomTom (2026) Pricing. Available at: </w:t>
       </w:r>
-      <w:hyperlink r:id="rId55">
+      <w:hyperlink r:id="rId64">
         <w:r>
           <w:rPr>
             <w:color w:val="174B76"/>
@@ -19188,7 +21180,7 @@
         </w:rPr>
         <w:t xml:space="preserve">Valero, A., Negm, H. and El-Geneidy, A. (2025) 'Exploring the (Mis)match between Reported and Calculated Commute Travel Times', Findings, August. </w:t>
       </w:r>
-      <w:hyperlink r:id="rId56">
+      <w:hyperlink r:id="rId65">
         <w:r>
           <w:rPr>
             <w:color w:val="174B76"/>
@@ -19209,7 +21201,7 @@
         </w:rPr>
         <w:t xml:space="preserve">Verma, R., Mittal, S. and Ukkusuri, S.V. (2025) 'Spatial Access of America: Multiple indicators of accessibility to opportunities', Scientific Data, 12(1), 1223. </w:t>
       </w:r>
-      <w:hyperlink r:id="rId57">
+      <w:hyperlink r:id="rId66">
         <w:r>
           <w:rPr>
             <w:color w:val="174B76"/>
@@ -19238,7 +21230,7 @@
         </w:rPr>
         <w:t xml:space="preserve">Bastarianto, F.F., Hancock, T.O., Ilahi, A., Manley, E. and Choudhury, C.F. (2025): </w:t>
       </w:r>
-      <w:hyperlink r:id="rId58">
+      <w:hyperlink r:id="rId67">
         <w:r>
           <w:rPr>
             <w:color w:val="174B76"/>
@@ -19259,7 +21251,7 @@
         </w:rPr>
         <w:t xml:space="preserve">Boeing, G. and Zhou, Y. (2026): </w:t>
       </w:r>
-      <w:hyperlink r:id="rId59">
+      <w:hyperlink r:id="rId68">
         <w:r>
           <w:rPr>
             <w:color w:val="174B76"/>
@@ -19280,7 +21272,7 @@
         </w:rPr>
         <w:t xml:space="preserve">Derrow-Pinion, A., She, J., Wong, D., Lange, O., Hester, T., Perez, L., Nunkesser, M., Lee, S., Guo, X., Wiltshire, B., Battaglia, P.W., Gupta, V., Li, A., Xu, Z., Sanchez-Gonzalez, A., Li, Y. and Veličković, P. (2021): </w:t>
       </w:r>
-      <w:hyperlink r:id="rId60">
+      <w:hyperlink r:id="rId69">
         <w:r>
           <w:rPr>
             <w:color w:val="174B76"/>
@@ -19301,7 +21293,7 @@
         </w:rPr>
         <w:t xml:space="preserve">Elnaggar, G.R., Al-Hourani, S. and Abutaha, R. (2025): </w:t>
       </w:r>
-      <w:hyperlink r:id="rId61">
+      <w:hyperlink r:id="rId70">
         <w:r>
           <w:rPr>
             <w:color w:val="174B76"/>
@@ -19322,7 +21314,7 @@
         </w:rPr>
         <w:t xml:space="preserve">Fu, X., Kakkar, D., Chen, J., Moynihan, K.M., Hegland, T.A. and Blossom, J. (2023): </w:t>
       </w:r>
-      <w:hyperlink r:id="rId62">
+      <w:hyperlink r:id="rId71">
         <w:r>
           <w:rPr>
             <w:color w:val="174B76"/>
@@ -19343,7 +21335,7 @@
         </w:rPr>
         <w:t xml:space="preserve">Hodson, T.O. (2022): </w:t>
       </w:r>
-      <w:hyperlink r:id="rId63">
+      <w:hyperlink r:id="rId72">
         <w:r>
           <w:rPr>
             <w:color w:val="174B76"/>
@@ -19364,7 +21356,7 @@
         </w:rPr>
         <w:t xml:space="preserve">Mansurova, A., Mussina, A., Aubakirov, S., Nugumanova, A. and Yedilkhan, D. (2025): </w:t>
       </w:r>
-      <w:hyperlink r:id="rId64">
+      <w:hyperlink r:id="rId73">
         <w:r>
           <w:rPr>
             <w:color w:val="174B76"/>
@@ -19385,7 +21377,7 @@
         </w:rPr>
         <w:t xml:space="preserve">Soon, K.L., Chan, R.K.C., Lim, J.M.-Y. and Parthiban, R. (2023): </w:t>
       </w:r>
-      <w:hyperlink r:id="rId65">
+      <w:hyperlink r:id="rId74">
         <w:r>
           <w:rPr>
             <w:color w:val="174B76"/>
@@ -19406,7 +21398,7 @@
         </w:rPr>
         <w:t xml:space="preserve">Valero, A., Negm, H. and El-Geneidy, A. (2025): </w:t>
       </w:r>
-      <w:hyperlink r:id="rId66">
+      <w:hyperlink r:id="rId75">
         <w:r>
           <w:rPr>
             <w:color w:val="174B76"/>
@@ -19427,7 +21419,7 @@
         </w:rPr>
         <w:t xml:space="preserve">Verma, R., Mittal, S. and Ukkusuri, S.V. (2025): </w:t>
       </w:r>
-      <w:hyperlink r:id="rId67">
+      <w:hyperlink r:id="rId76">
         <w:r>
           <w:rPr>
             <w:color w:val="174B76"/>

</xml_diff>

<commit_message>
Update reviewed report and delivery instructions for the submission deadline
</commit_message>
<xml_diff>
--- a/RMT_A3_Team_AkhanovYerdaulet_ShadiyarbekSyrym_SabyrzhanAkylbek.docx
+++ b/RMT_A3_Team_AkhanovYerdaulet_ShadiyarbekSyrym_SabyrzhanAkylbek.docx
@@ -2057,7 +2057,7 @@
           </w:tcPr>
           <w:p>
             <w:pPr>
-              <w:keepNext/>
+              <w:keepNext w:val="0"/>
               <w:spacing w:after="40" w:line="240" w:lineRule="auto"/>
             </w:pPr>
             <w:r>
@@ -2077,16 +2077,16 @@
           </w:tcPr>
           <w:p>
             <w:pPr>
-              <w:keepNext/>
-              <w:spacing w:after="40" w:line="240" w:lineRule="auto"/>
-            </w:pPr>
-            <w:r>
-              <w:rPr>
-                <w:rFonts w:ascii="Arial" w:hAnsi="Arial"/>
-                <w:color w:val="000000"/>
-                <w:sz w:val="18"/>
-              </w:rPr>
-              <w:t>17:30–19:30</w:t>
+              <w:keepNext w:val="0"/>
+              <w:spacing w:after="40" w:line="240" w:lineRule="auto"/>
+            </w:pPr>
+            <w:r>
+              <w:rPr>
+                <w:rFonts w:ascii="Arial" w:hAnsi="Arial"/>
+                <w:color w:val="000000"/>
+                <w:sz w:val="18"/>
+              </w:rPr>
+              <w:t>17:30–17:40</w:t>
             </w:r>
           </w:p>
         </w:tc>
@@ -2097,7 +2097,7 @@
           </w:tcPr>
           <w:p>
             <w:pPr>
-              <w:keepNext/>
+              <w:keepNext w:val="0"/>
               <w:spacing w:after="40" w:line="240" w:lineRule="auto"/>
             </w:pPr>
             <w:r>
@@ -2107,91 +2107,6 @@
                 <w:sz w:val="18"/>
               </w:rPr>
               <w:t>peak</w:t>
-            </w:r>
-          </w:p>
-        </w:tc>
-        <w:tc>
-          <w:tcPr>
-            <w:tcW w:type="dxa" w:w="1701"/>
-            <w:vAlign w:val="center"/>
-          </w:tcPr>
-          <w:p>
-            <w:pPr>
-              <w:keepNext/>
-              <w:spacing w:after="40" w:line="240" w:lineRule="auto"/>
-            </w:pPr>
-            <w:r>
-              <w:rPr>
-                <w:rFonts w:ascii="Arial" w:hAnsi="Arial"/>
-                <w:color w:val="000000"/>
-                <w:sz w:val="18"/>
-              </w:rPr>
-              <w:t>20</w:t>
-            </w:r>
-          </w:p>
-        </w:tc>
-      </w:tr>
-      <w:tr>
-        <w:trPr>
-          <w:cantSplit/>
-        </w:trPr>
-        <w:tc>
-          <w:tcPr>
-            <w:tcW w:type="dxa" w:w="2551"/>
-            <w:vAlign w:val="center"/>
-          </w:tcPr>
-          <w:p>
-            <w:pPr>
-              <w:keepNext w:val="0"/>
-              <w:spacing w:after="40" w:line="240" w:lineRule="auto"/>
-            </w:pPr>
-            <w:r>
-              <w:rPr>
-                <w:rFonts w:ascii="Arial" w:hAnsi="Arial"/>
-                <w:color w:val="000000"/>
-                <w:sz w:val="18"/>
-              </w:rPr>
-              <w:t>25 Oct 2026</w:t>
-            </w:r>
-          </w:p>
-        </w:tc>
-        <w:tc>
-          <w:tcPr>
-            <w:tcW w:type="dxa" w:w="3118"/>
-            <w:vAlign w:val="center"/>
-          </w:tcPr>
-          <w:p>
-            <w:pPr>
-              <w:keepNext w:val="0"/>
-              <w:spacing w:after="40" w:line="240" w:lineRule="auto"/>
-            </w:pPr>
-            <w:r>
-              <w:rPr>
-                <w:rFonts w:ascii="Arial" w:hAnsi="Arial"/>
-                <w:color w:val="000000"/>
-                <w:sz w:val="18"/>
-              </w:rPr>
-              <w:t>22:00–00:00</w:t>
-            </w:r>
-          </w:p>
-        </w:tc>
-        <w:tc>
-          <w:tcPr>
-            <w:tcW w:type="dxa" w:w="2268"/>
-            <w:vAlign w:val="center"/>
-          </w:tcPr>
-          <w:p>
-            <w:pPr>
-              <w:keepNext w:val="0"/>
-              <w:spacing w:after="40" w:line="240" w:lineRule="auto"/>
-            </w:pPr>
-            <w:r>
-              <w:rPr>
-                <w:rFonts w:ascii="Arial" w:hAnsi="Arial"/>
-                <w:color w:val="000000"/>
-                <w:sz w:val="18"/>
-              </w:rPr>
-              <w:t>offpeak</w:t>
             </w:r>
           </w:p>
         </w:tc>
@@ -2231,7 +2146,7 @@
           <w:rFonts w:ascii="Arial" w:hAnsi="Arial"/>
           <w:color w:val="000000"/>
         </w:rPr>
-        <w:t>One prospective batch of 20 pairs is eligible in each window, at the first available worker check; the total cap is 100 further Google requests. Actual timestamps determine coverage. Missed windows are not backfilled. Planning a batch does not count it as observed; actual counts appear in Segment 4.</w:t>
+        <w:t>One prospective batch of 20 pairs is eligible in each window; the cap is 80 further Google requests. The confirmed submission deadline is 25 October at 18:00 Astana; collection ends at 17:40. Actual timestamps determine coverage. Missed windows are not backfilled; actual counts appear in Segment 4.</w:t>
       </w:r>
     </w:p>
     <w:p>
@@ -2284,7 +2199,7 @@
           <w:rFonts w:ascii="Arial" w:hAnsi="Arial"/>
           <w:color w:val="000000"/>
         </w:rPr>
-        <w:t>The pilot plan uses 3 complete cycles with 300 seconds between the end of one cycle and the next. The scheduled plan rotates 4 routes every 15 minutes within a bounded 48-hour window. Each route therefore has a nominal 75-minute revisit. Scheduler delays remain visible through actual request times. No past observation is backfilled. Reproduction uses the versioned configuration and dependency file; Python 3.12.14 processed this snapshot. A future provider pair must use the same endpoints, car mode and closely aligned request starts.</w:t>
+        <w:t>The pilot plan uses 3 complete cycles with 300 seconds between the end of one cycle and the next. The initial scheduled plan rotates 4 routes every 15 minutes within a 48-hour window, shortened by the dated submission amendment. Each route has a nominal 75-minute revisit. Scheduler delays remain visible through actual request times. No past observation is backfilled. Reproduction uses the versioned configuration and dependency file; Python 3.12.14 processed this snapshot. A future provider pair must use the same endpoints, car mode and closely aligned request starts.</w:t>
       </w:r>
     </w:p>
     <w:p>
@@ -19322,7 +19237,7 @@
                 <w:color w:val="000000"/>
                 <w:sz w:val="18"/>
               </w:rPr>
-              <w:t>5 windows; at most 100 pairs</w:t>
+              <w:t>4 windows; at most 80 pairs</w:t>
             </w:r>
           </w:p>
         </w:tc>
@@ -19642,7 +19557,7 @@
                 <w:color w:val="000000"/>
                 <w:sz w:val="18"/>
               </w:rPr>
-              <w:t>3 / 0</w:t>
+              <w:t>2 / 0</w:t>
             </w:r>
           </w:p>
         </w:tc>
@@ -19722,7 +19637,7 @@
           <w:rFonts w:ascii="Arial" w:hAnsi="Arial"/>
           <w:color w:val="000000"/>
         </w:rPr>
-        <w:t xml:space="preserve">Follow-up summary timestamp: 2026-10-24T11:36:46.249129+00:00. Window summaries require at least five valid pairs. The period statistic is a median of window medians, not a pooled route-level median. Source: </w:t>
+        <w:t xml:space="preserve">Follow-up summary timestamp: 2026-10-24T12:09:50.506216+00:00. Window summaries require at least five valid pairs. The period statistic is a median of window medians, not a pooled route-level median. Source: </w:t>
       </w:r>
       <w:hyperlink r:id="rId48">
         <w:r>
@@ -20602,7 +20517,7 @@
           <w:rFonts w:ascii="Arial" w:hAnsi="Arial"/>
           <w:color w:val="000000"/>
         </w:rPr>
-        <w:t>Access and publication terms changed the feasible design. The main collector remains an ORS instrument, while the later approved protocol adds five bounded Google–ORS windows under aggregate-only retention. This is an explicit change of comparator and analysis, not a retrospective rewriting of the original expectations. The route set and period definitions remain fixed. Future interpretation will compare per-window summaries descriptively, retain actual dates and sample counts, and report missed windows instead of filling them.</w:t>
+        <w:t>Access and publication terms changed the feasible design. The main collector remains an ORS instrument, while the amended protocol contains 4 bounded Google–ORS windows under aggregate-only retention. The confirmed submission deadline shortened the last evening window and removed a later night window before either occurred. Original expectations remain preserved. The route set and period definitions remain fixed. Interpretation will compare per-window summaries descriptively, retain actual dates and sample counts, and report missed windows instead of filling them. Two observed dates cannot represent long-term traffic variability.</w:t>
       </w:r>
     </w:p>
     <w:p>

</xml_diff>